<commit_message>
Revise chapter 1: source audit, literature synthesis and model interpretation
</commit_message>
<xml_diff>
--- a/research/02_chip_trade/documents/chapter1.docx
+++ b/research/02_chip_trade/documents/chapter1.docx
@@ -12,7 +12,7 @@
     </w:p>
     <w:p>
       <w:r>
-        <w:t>Изменение структуры экспортных поставок может сопровождаться как ослаблением, так и усилением колебаний экспортной выручки. Для интегральных схем эта связь представляет особый интерес: страны специализируются на разных видах продукции, а поставки в несколько государств могут обслуживать одну производственную цепочку. Поэтому оценка диверсификации требует учитывать не только распределение экспортных долей, но и совместную динамику соответствующих потоков. В настоящей главе рассматриваются особенности отрасли, экономические механизмы диверсификации и основные подходы к измерению экспортной волатильности. На этой основе формулируется исследовательский вопрос о том, как товарная структура и география поставок связаны с условной исторической волатильностью экспорта интегральных схем Японии и Республики Корея.</w:t>
+        <w:t>Диверсификация экспорта обычно связывается с уменьшением зависимости от отдельных товаров и покупателей. Однако более равномерное распределение поставок не определяет однозначно изменчивость их стоимости. Значение имеют волатильность каждого потока и степень согласованности колебаний между ними. Для интегральных схем эта проблема особенно существенна: товарные категории различаются по ценовой динамике, а несколько стран назначения могут обслуживать один рынок конечной продукции. В главе рассматриваются экономические механизмы этой связи и результаты существующих исследований. На их основе обосновывается оценка товарного и географического вкладов в изменение условной исторической волатильности экспорта интегральных схем Японии и Республики Корея.</w:t>
       </w:r>
     </w:p>
     <w:p>
@@ -25,7 +25,7 @@
     </w:p>
     <w:p>
       <w:r>
-        <w:t>Интегральные схемы относятся к промежуточным товарам, используемым при производстве электронной техники и других видов оборудования. При этом международное разделение труда в отрасли охватывает несколько технологически самостоятельных стадий. В докладе OECD выделяются проектирование, изготовление на полупроводниковых пластинах, а также сборка, тестирование и корпусирование. Каждая стадия опирается на специализированные материалы, оборудование и знания. В результате экспорт чипов отражает участие страны в определенном участке цепочки, тогда как полный цикл создания продукта может быть распределен между несколькими экономиками.</w:t>
+        <w:t>Интегральные схемы используются как промежуточные товары при производстве электронной техники и других видов оборудования. Международное разделение труда в отрасли охватывает несколько технологических стадий. В докладе Организации экономического сотрудничества и развития (ОЭСР) выделяются проектирование, изготовление на полупроводниковых пластинах, а также сборка, тестирование и корпусирование. Каждая стадия опирается на специализированные материалы, оборудование и знания. Полный цикл создания продукта может быть распределен между несколькими экономиками, поэтому торговый поток необходимо рассматривать в связи с местом его участников в производственной цепочке.</w:t>
       </w:r>
       <w:r>
         <w:rPr>
@@ -37,7 +37,7 @@
     </w:p>
     <w:p>
       <w:r>
-        <w:t>Существование различных организационных моделей усиливает значение такого разделения. Компании могут совмещать разработку и производство, специализироваться на проектировании либо изготавливать продукцию по заказам других участников. Пограничное перемещение товара при этом не обязательно совпадает с передачей продукта конечному потребителю. Для экономического анализа отсюда следует различие между местом разработки технологии, местом изготовления и страной, в которой зарегистрирован очередной торговый поток. Таможенная статистика позволяет подробно описать последний из этих процессов, однако сама по себе не восстанавливает всю последовательность производственных операций.</w:t>
+        <w:t>Существование различных организационных моделей усиливает значение такого разделения. Компании могут совмещать разработку и производство, специализироваться на проектировании либо изготавливать продукцию по заказам других участников. Пересечение границы не обязательно совпадает с передачей изделия конечному потребителю или со сменой его собственника. Таможенная стоимость поэтому характеризует валовой торговый поток, а не созданную внутри страны добавленную стоимость и не бухгалтерскую выручку конкретной компании. В дальнейшем выражение «экспортная выручка» используется как краткое обозначение номинальной стоимости зарегистрированных поставок.</w:t>
       </w:r>
     </w:p>
     <w:p>
@@ -54,7 +54,7 @@
     </w:p>
     <w:p>
       <w:r>
-        <w:t>Для анализа торговой статистики необходимо установить товарные границы исследования. В Гармонизированной системе интегральные схемы относятся к позиции 8542. На шестизначном уровне выделяются процессоры и контроллеры — 854231, запоминающие устройства — 854232, усилители — 854233, прочие интегральные схемы — 854239, а также части — 854290. Перечисленные категории присутствуют в редакциях HS 2017 и HS 2022. Основной объект настоящей работы составляют четыре категории схем; части рассматриваются отдельно. Такое определение позволяет проводить сопоставление стран в одинаковых товарных границах.</w:t>
+        <w:t>Для анализа торговой статистики необходимо установить товарные границы исследования. В Гармонизированной системе описания и кодирования товаров (HS) интегральные схемы относятся к позиции 8542. На шестизначном уровне выделяются процессоры и контроллеры — 854231, запоминающие устройства — 854232, усилители — 854233, прочие интегральные схемы — 854239, а также части — 854290. Эти коды и их основные наименования сохраняются в редакциях HS 2017 и HS 2022. Основную совокупность исследования составляют первые четыре категории; части включаются в отдельную проверку чувствительности. Такое определение обеспечивает одинаковые товарные границы сравнения стран.</w:t>
       </w:r>
       <w:r>
         <w:rPr>
@@ -82,7 +82,7 @@
     </w:p>
     <w:p>
       <w:r>
-        <w:t>Группа 8542 охватывает лишь часть полупроводниковой отрасли. В нее не входят все материалы, производственное оборудование и дискретные приборы. Кроме того, шестизначная классификация не позволяет непосредственно установить технологический уровень каждой схемы или ее конечное применение. Например, категория процессоров и контроллеров не ограничивается передовыми вычислительными ускорителями, а категория памяти объединяет различные виды запоминающих устройств. Поэтому изменение доли товарного кода характеризует состав зарегистрированного экспорта. Для вывода о технологическом усложнении продукции необходима более подробная информация.</w:t>
+        <w:t>Позиция 8542 охватывает лишь часть полупроводниковой отрасли. В нее не входят все материалы, производственное оборудование и дискретные приборы. Кроме того, шестизначная классификация не позволяет непосредственно установить технологический уровень каждой схемы или ее конечное применение. Например, категория процессоров и контроллеров не ограничивается передовыми вычислительными ускорителями, а категория памяти объединяет различные виды запоминающих устройств. Поэтому изменение доли товарного кода характеризует состав зарегистрированного экспорта. Для вывода о технологическом усложнении продукции необходима более подробная информация.</w:t>
       </w:r>
     </w:p>
     <w:p>
@@ -135,12 +135,7 @@
     </w:p>
     <w:p>
       <w:r>
-        <w:t>Это различие важно для понимания международного характера исследования. Экспорт Японии и Республики Корея включен в производственные связи с Китаем, экономиками Восточной и Юго-Восточной Азии, США и европейскими странами. Анализ двух экспортеров позволяет сопоставить изменения внутри общего отраслевого пространства. При этом сведения о стране назначения используются в их прямом статистическом значении. Восстановление конечного спроса потребовало бы отдельной модели межотраслевых связей или данных о последующей переработке и реэкспорте.</w:t>
-      </w:r>
-    </w:p>
-    <w:p>
-      <w:r>
-        <w:t>Торговые и технологические ограничения дополняют экономические источники неопределенности. Koh рассматривает положение корейской отрасли в условиях экспортного контроля, международного размещения производств и стратегического соперничества. Из этого анализа следует, что условия доступа к рынкам и технологиям могут затрагивать несколько участков цепочки одновременно. Для исследования волатильности такие изменения представляют экономический контекст. Их самостоятельное воздействие нельзя определить лишь по совпадению даты политического решения с изменением экспортной доли.</w:t>
+        <w:t>Выбор Японии и Республики Корея позволяет сопоставить экспортеров одной группы промежуточных товаров с различной отраслевой специализацией. Банк Кореи уже отмечал различия в динамике полупроводникового экспорта этих стран и связывал большую амплитуду корейского цикла с товарным составом и структурой спроса. Такое сопоставление дает основание проверить, различается ли роль товарных и географических сдвигов внутри одинаковых категорий HS. Япония при этом выступает самостоятельным объектом сравнительного анализа; предположение о ее использовании в качестве контрольной группы для оценки корейской политики не вводится.</w:t>
       </w:r>
       <w:r>
         <w:rPr>
@@ -152,13 +147,25 @@
     </w:p>
     <w:p>
       <w:r>
+        <w:t>Торговые и технологические ограничения дополняют экономические источники неопределенности. Koh рассматривает положение корейской отрасли в условиях экспортного контроля, международного размещения производств и стратегического соперничества. Из этого анализа следует, что условия доступа к рынкам и технологиям могут затрагивать несколько участков цепочки одновременно. Для исследования волатильности такие изменения представляют экономический контекст. Их самостоятельное воздействие нельзя определить лишь по совпадению даты политического решения с изменением экспортной доли.</w:t>
+      </w:r>
+      <w:r>
+        <w:rPr>
+          <w:rStyle w:val="FootnoteReference"/>
+        </w:rPr>
+        <w:footnoteReference w:id="10"/>
+      </w:r>
+      <w:r/>
+    </w:p>
+    <w:p>
+      <w:r>
         <w:t>Наконец, следует учитывать различие между бесперебойностью снабжения и стабильностью экспортной выручки. Li и соавторы исследуют устойчивость мировой полупроводниковой торговой сети к случайному и направленному исключению узлов. В центре такого анализа находятся связность и структура сети. В настоящей работе рассматриваются колебания стоимости экспортных потоков во времени. Обе постановки относятся к экономическим рискам отрасли, однако измеряют разные явления: сохранение торговых связей не исключает сильного падения цен и выручки.</w:t>
       </w:r>
       <w:r>
         <w:rPr>
           <w:rStyle w:val="FootnoteReference"/>
         </w:rPr>
-        <w:footnoteReference w:id="10"/>
+        <w:footnoteReference w:id="11"/>
       </w:r>
       <w:r/>
     </w:p>
@@ -177,18 +184,18 @@
     </w:p>
     <w:p>
       <w:r>
-        <w:t>Экспортная диверсификация предполагает распределение поставок между несколькими товарами или рынками. Товарная диверсификация характеризует состав продукции, географическая — направления ее реализации. Эти измерения взаимосвязаны: у каждой товарной категории имеется собственное распределение покупателей. Поэтому изменение совокупной географии может быть обусловлено как переориентацией конкретного товара, так и ростом доли товара, который изначально поставлялся на другие рынки. Разделение этих процессов необходимо для экономического объяснения наблюдаемых структурных сдвигов.</w:t>
+        <w:t>Экспортная диверсификация означает расширение набора товаров и рынков либо более равномерное распределение поставок между ними. Товарное измерение характеризует состав продукции, географическое — направления ее реализации. Они взаимосвязаны: у каждой категории имеется собственное распределение покупателей. Поэтому изменение совокупной географии может быть обусловлено как переориентацией конкретного товара, так и ростом доли товара, который изначально поставлялся на другие рынки. Разделение этих процессов необходимо для объяснения структурных сдвигов.</w:t>
       </w:r>
     </w:p>
     <w:p>
       <w:r>
-        <w:t>Cadot, Carrère и Strauss-Kahn систематизируют показатели диверсификации и исследования ее связи с развитием. В их обзоре рассматриваются изменения разнообразия экспортируемых товаров и распределения поставок между ними. Для прикладного анализа полезно различать появление новых торговых связей и перераспределение стоимости внутри уже существующих. Рост количества направлений может происходить за счет небольших и нерегулярных поставок, почти не меняющих зависимость от основных покупателей. Поэтому число товаров или партнеров желательно дополнять показателями их относительной значимости.</w:t>
+        <w:t>Cadot, Carrère и Strauss-Kahn различают расширение набора экспортируемых товаров и перераспределение стоимости внутри существующего набора, то есть экстенсивную и интенсивную стороны диверсификации. При анализе направлений аналогичное различие возникает между появлением нового покупателя и изменением долей прежних рынков. Количество направлений может увеличиваться за счет небольших и нерегулярных поставок, почти не меняющих зависимость от основных покупателей. Поэтому число товаров или партнеров следует дополнять показателями их относительной значимости.</w:t>
       </w:r>
       <w:r>
         <w:rPr>
           <w:rStyle w:val="FootnoteReference"/>
         </w:rPr>
-        <w:footnoteReference w:id="11"/>
+        <w:footnoteReference w:id="12"/>
       </w:r>
       <w:r/>
     </w:p>
@@ -197,7 +204,30 @@
         <w:keepNext/>
       </w:pPr>
       <w:r>
-        <w:t>Одним из распространенных показателей является индекс Херфиндаля — Хиршмана. Если доля поставок на рынок j обозначена sⱼ, индекс определяется суммой квадратов долей:</w:t>
+        <w:t xml:space="preserve">Одним из распространенных показателей концентрации является индекс Херфиндаля — Хиршмана (HHI). Если </w:t>
+      </w:r>
+      <m:oMath>
+        <m:sSub>
+          <m:e>
+            <m:r>
+              <m:rPr>
+                <m:sty m:val="i"/>
+              </m:rPr>
+              <m:t>s</m:t>
+            </m:r>
+          </m:e>
+          <m:sub>
+            <m:r>
+              <m:rPr>
+                <m:sty m:val="i"/>
+              </m:rPr>
+              <m:t>j</m:t>
+            </m:r>
+          </m:sub>
+        </m:sSub>
+      </m:oMath>
+      <w:r>
+        <w:t xml:space="preserve"> — доля рынка j в общей стоимости экспорта рассматриваемой группы, индекс определяется суммой квадратов неотрицательных долей:</w:t>
       </w:r>
     </w:p>
     <w:p>
@@ -237,7 +267,7 @@
                 <m:e>
                   <m:r>
                     <m:rPr>
-                      <m:sty m:val="p"/>
+                      <m:sty m:val="i"/>
                     </m:rPr>
                     <m:t>s</m:t>
                   </m:r>
@@ -245,7 +275,7 @@
                 <m:sub>
                   <m:r>
                     <m:rPr>
-                      <m:sty m:val="p"/>
+                      <m:sty m:val="i"/>
                     </m:rPr>
                     <m:t>j</m:t>
                   </m:r>
@@ -287,7 +317,7 @@
                 <m:e>
                   <m:r>
                     <m:rPr>
-                      <m:sty m:val="p"/>
+                      <m:sty m:val="i"/>
                     </m:rPr>
                     <m:t>s</m:t>
                   </m:r>
@@ -295,7 +325,7 @@
                 <m:sub>
                   <m:r>
                     <m:rPr>
-                      <m:sty m:val="p"/>
+                      <m:sty m:val="i"/>
                     </m:rPr>
                     <m:t>j</m:t>
                   </m:r>
@@ -314,7 +344,7 @@
     </w:p>
     <w:p>
       <w:r>
-        <w:t>При долях, выраженных от нуля до единицы, максимальное значение индекса равно единице и соответствует одному направлению. Для N одинаковых долей индекс составляет 1/N. Квадраты придают больший вес крупным рынкам, поэтому показатель реагирует на перераспределение экспортной стоимости. Вместе с тем результат зависит от уровня детализации. Объединение нескольких направлений в одну группу повышает их совокупный вклад в индекс по сравнению с раздельным учетом. Сопоставлять структуры следует на одинаковой сетке категорий.</w:t>
+        <w:t>При N возможных направлениях и долях, выраженных от нуля до единицы, HHI находится в пределах от 1/N до 1. Нижняя граница достигается при равных долях, верхняя — при поставках на один рынок. Квадраты придают больший вес крупным направлениям. Аналогично рассчитываются товарная концентрация и концентрация отдельных сочетаний товара и рынка, но эти индексы описывают разные распределения. На результат влияет и детализация: объединение направлений с положительными долями повышает HHI. Поэтому сопоставление требует одинаковой сетки категорий; укрупненный остаток остальных стран нельзя трактовать как отдельный однородный рынок.</w:t>
       </w:r>
     </w:p>
     <w:p>
@@ -325,16 +355,67 @@
         <w:rPr>
           <w:rStyle w:val="FootnoteReference"/>
         </w:rPr>
-        <w:footnoteReference w:id="12"/>
+        <w:footnoteReference w:id="13"/>
       </w:r>
       <w:r/>
+    </w:p>
+    <w:p>
+      <w:r>
+        <w:t>Под волатильностью далее понимается стандартное отклонение темпов изменения экспортной стоимости за выбранный период. Соответствующая дисперсия измеряет разброс темпов относительно их среднего, учитывая и рост, и падение. Поэтому она не является мерой только неблагоприятных исходов и не характеризует вероятность прекращения поставок. Такое определение соответствует задаче оценки амплитуды исторических колебаний.</w:t>
+      </w:r>
     </w:p>
     <w:p>
       <w:pPr>
         <w:keepNext/>
       </w:pPr>
       <w:r>
-        <w:t>Пусть gᵢ обозначает темп изменения стоимости поставок в товарно-географической ячейке i, а wᵢ — ее фиксированный вес. Обозначим взвешенную сумму темпов через G. Ее дисперсия имеет следующий вид:</w:t>
+        <w:t xml:space="preserve">Пусть </w:t>
+      </w:r>
+      <m:oMath>
+        <m:sSub>
+          <m:e>
+            <m:r>
+              <m:rPr>
+                <m:sty m:val="i"/>
+              </m:rPr>
+              <m:t>g</m:t>
+            </m:r>
+          </m:e>
+          <m:sub>
+            <m:r>
+              <m:rPr>
+                <m:sty m:val="i"/>
+              </m:rPr>
+              <m:t>i</m:t>
+            </m:r>
+          </m:sub>
+        </m:sSub>
+      </m:oMath>
+      <w:r>
+        <w:t xml:space="preserve"> — темп изменения стоимости поставок в ячейке i, объединяющей товар и направление, а </w:t>
+      </w:r>
+      <m:oMath>
+        <m:sSub>
+          <m:e>
+            <m:r>
+              <m:rPr>
+                <m:sty m:val="i"/>
+              </m:rPr>
+              <m:t>w</m:t>
+            </m:r>
+          </m:e>
+          <m:sub>
+            <m:r>
+              <m:rPr>
+                <m:sty m:val="i"/>
+              </m:rPr>
+              <m:t>i</m:t>
+            </m:r>
+          </m:sub>
+        </m:sSub>
+      </m:oMath>
+      <w:r>
+        <w:t xml:space="preserve"> — ее фиксированный неотрицательный вес; сумма весов равна единице. Взвешенная сумма темпов обозначается G, ковариационная матрица темпов — Σ. Для одной и той же совокупности наблюдений выполняется тождество:</w:t>
       </w:r>
     </w:p>
     <w:p>
@@ -352,7 +433,55 @@
             <m:rPr>
               <m:sty m:val="p"/>
             </m:rPr>
-            <m:t>Var(G) = </m:t>
+            <m:t>Var(</m:t>
+          </m:r>
+          <m:r>
+            <m:rPr>
+              <m:sty m:val="i"/>
+            </m:rPr>
+            <m:t>G</m:t>
+          </m:r>
+          <m:r>
+            <m:rPr>
+              <m:sty m:val="p"/>
+            </m:rPr>
+            <m:t>) = </m:t>
+          </m:r>
+          <m:sSup>
+            <m:e>
+              <m:r>
+                <m:rPr>
+                  <m:sty m:val="i"/>
+                </m:rPr>
+                <m:t>w</m:t>
+              </m:r>
+            </m:e>
+            <m:sup>
+              <m:r>
+                <m:rPr>
+                  <m:sty m:val="p"/>
+                </m:rPr>
+                <m:t>T</m:t>
+              </m:r>
+            </m:sup>
+          </m:sSup>
+          <m:r>
+            <m:rPr>
+              <m:sty m:val="p"/>
+            </m:rPr>
+            <m:t>Σ</m:t>
+          </m:r>
+          <m:r>
+            <m:rPr>
+              <m:sty m:val="i"/>
+            </m:rPr>
+            <m:t>w</m:t>
+          </m:r>
+          <m:r>
+            <m:rPr>
+              <m:sty m:val="p"/>
+            </m:rPr>
+            <m:t> = </m:t>
           </m:r>
           <m:nary>
             <m:naryPr>
@@ -374,7 +503,7 @@
                 <m:e>
                   <m:r>
                     <m:rPr>
-                      <m:sty m:val="p"/>
+                      <m:sty m:val="i"/>
                     </m:rPr>
                     <m:t>w</m:t>
                   </m:r>
@@ -382,7 +511,7 @@
                 <m:sub>
                   <m:r>
                     <m:rPr>
-                      <m:sty m:val="p"/>
+                      <m:sty m:val="i"/>
                     </m:rPr>
                     <m:t>i</m:t>
                   </m:r>
@@ -406,7 +535,7 @@
                 <m:e>
                   <m:r>
                     <m:rPr>
-                      <m:sty m:val="p"/>
+                      <m:sty m:val="i"/>
                     </m:rPr>
                     <m:t>g</m:t>
                   </m:r>
@@ -414,7 +543,7 @@
                 <m:sub>
                   <m:r>
                     <m:rPr>
-                      <m:sty m:val="p"/>
+                      <m:sty m:val="i"/>
                     </m:rPr>
                     <m:t>i</m:t>
                   </m:r>
@@ -454,7 +583,7 @@
                 <m:e>
                   <m:r>
                     <m:rPr>
-                      <m:sty m:val="p"/>
+                      <m:sty m:val="i"/>
                     </m:rPr>
                     <m:t>w</m:t>
                   </m:r>
@@ -462,7 +591,7 @@
                 <m:sub>
                   <m:r>
                     <m:rPr>
-                      <m:sty m:val="p"/>
+                      <m:sty m:val="i"/>
                     </m:rPr>
                     <m:t>i</m:t>
                   </m:r>
@@ -478,7 +607,7 @@
                 <m:e>
                   <m:r>
                     <m:rPr>
-                      <m:sty m:val="p"/>
+                      <m:sty m:val="i"/>
                     </m:rPr>
                     <m:t>w</m:t>
                   </m:r>
@@ -486,7 +615,7 @@
                 <m:sub>
                   <m:r>
                     <m:rPr>
-                      <m:sty m:val="p"/>
+                      <m:sty m:val="i"/>
                     </m:rPr>
                     <m:t>j</m:t>
                   </m:r>
@@ -502,7 +631,7 @@
                 <m:e>
                   <m:r>
                     <m:rPr>
-                      <m:sty m:val="p"/>
+                      <m:sty m:val="i"/>
                     </m:rPr>
                     <m:t>g</m:t>
                   </m:r>
@@ -510,7 +639,7 @@
                 <m:sub>
                   <m:r>
                     <m:rPr>
-                      <m:sty m:val="p"/>
+                      <m:sty m:val="i"/>
                     </m:rPr>
                     <m:t>i</m:t>
                   </m:r>
@@ -526,7 +655,7 @@
                 <m:e>
                   <m:r>
                     <m:rPr>
-                      <m:sty m:val="p"/>
+                      <m:sty m:val="i"/>
                     </m:rPr>
                     <m:t>g</m:t>
                   </m:r>
@@ -534,7 +663,7 @@
                 <m:sub>
                   <m:r>
                     <m:rPr>
-                      <m:sty m:val="p"/>
+                      <m:sty m:val="i"/>
                     </m:rPr>
                     <m:t>j</m:t>
                   </m:r>
@@ -553,29 +682,17 @@
     </w:p>
     <w:p>
       <w:r>
-        <w:t>Первое слагаемое отражает собственную изменчивость потоков с учетом их весов. Второе характеризует совместные колебания разных ячеек. Если поставки одновременно увеличиваются и сокращаются, положительные ковариации ограничивают возможности сглаживания. При слабой связи между потоками совокупные колебания могут быть меньше. Таким образом, распределение экспорта между несколькими странами создает предпосылки для диверсификации риска только с учетом того, как движутся соответствующие ряды.</w:t>
+        <w:t>Первое слагаемое отражает собственные дисперсии потоков с учетом их весов. Второе характеризует совместные колебания; суммирование по i &lt; j учитывает каждую пару один раз, поэтому перед суммой стоит множитель 2. Положительные ковариации увеличивают дисперсию относительно случая с теми же весами и собственными дисперсиями, но независимыми потоками. Отрицательные ковариации создают возможность взаимной компенсации. Значение нового направления определяется тем самым его связью со всем экспортным портфелем.</w:t>
       </w:r>
     </w:p>
     <w:p>
       <w:r>
-        <w:t>Связь между концентрацией и дисперсией особенно наглядна при упрощающем предположении об одинаковой дисперсии всех потоков и отсутствии ковариаций. Тогда дисперсия их взвешенной суммы пропорциональна сумме квадратов весов. Именно в этом частном случае индекс концентрации непосредственно связан с мерой волатильности. Для интегральных схем предположение об одинаковой изменчивости разных товаров и независимости рынков требует проверки. Отраслевые ценовые циклы и общие производственные связи дают основания ожидать его нарушения.</w:t>
+        <w:t>Связь концентрации с дисперсией особенно наглядна при одинаковой дисперсии всех потоков и нулевых ковариациях. Тогда дисперсия взвешенной суммы равна общей дисперсии одного потока, умноженной на HHI тех же ячеек. Это частный случай, в котором уменьшение концентрации однозначно снижает волатильность. В общем случае перенос веса на менее крупный, но более волатильный поток либо на направление с высокой ковариацией с остальными поставками способен дать противоположный результат. Поэтому даже снижение HHI на неизменной сетке еще не определяет знак изменения дисперсии.</w:t>
       </w:r>
     </w:p>
     <w:p>
       <w:r>
-        <w:t>В исследованиях на уровне национальных экономик значение состава специализации раскрывается у Koren и Tenreyro. Авторы разделяют вклад отраслевых колебаний, общих страновых шоков и их взаимодействия в волатильность выпуска. Их постановка показывает, что узкая специализация сама по себе не исчерпывает объяснения нестабильности. Важно, на каких отраслях специализируется экономика и каким колебаниям они подвержены. Для анализа интегральных схем аналогичный вопрос возникает внутри одной отрасли: перераспределение между категориями с разной динамикой может иметь значение при неизменном количестве товарных кодов.</w:t>
-      </w:r>
-      <w:r>
-        <w:rPr>
-          <w:rStyle w:val="FootnoteReference"/>
-        </w:rPr>
-        <w:footnoteReference w:id="13"/>
-      </w:r>
-      <w:r/>
-    </w:p>
-    <w:p>
-      <w:r>
-        <w:t>Caselli и соавторы рассматривают два противоположно направленных механизма влияния торговли на волатильность. Международная специализация может усиливать зависимость от отдельных отраслей, тогда как расширение международных связей позволяет распределять воздействие страновых шоков. Итог определяется совместным действием этих механизмов. Для настоящей работы существенен сам принцип неоднозначности результата. Исследование авторов относится к волатильности дохода в структурной модели, поэтому его количественные оценки нельзя непосредственно переносить на номинальную экспортную выручку одной товарной группы.</w:t>
+        <w:t>Значение состава специализации раскрывается в работе Koren и Tenreyro. Авторы разделяют вклад отраслевых колебаний, общих страновых шоков и их ковариации в волатильность выпуска. По мере развития экономики меняется не только степень концентрации, но и набор отраслей, на которых она специализируется. Для интегральных схем аналогичный вопрос возникает внутри одной отрасли: перераспределение между категориями с разной динамикой может менять волатильность при неизменном количестве товарных кодов.</w:t>
       </w:r>
       <w:r>
         <w:rPr>
@@ -587,7 +704,7 @@
     </w:p>
     <w:p>
       <w:r>
-        <w:t>На уровне фирм значение географического разнообразия также зависит от условий деятельности. Vannoorenberghe, Wang и Yu изучают китайских экспортеров и обнаруживают различия между малыми и крупными компаниями. У небольших фирм выход на дополнительные рынки может сопровождаться эпизодическими поставками и повышенной волатильностью; у крупных наблюдается иной характер связи. Этот результат показывает, почему расширение географии не следует автоматически трактовать как уменьшение колебаний. Одновременно фирменные закономерности требуют осторожного сопоставления с агрегированными страновыми данными.</w:t>
+        <w:t>Caselli и соавторы рассматривают совместное действие отраслевой специализации и международной диверсификации. Расширение торговли меняет подверженность отраслевым шокам, но одновременно позволяет распределять источники спроса и предложения между странами. Результат зависит от дисперсий и ковариаций шоков, а также от свойств отраслей специализации. Исследование относится к волатильности дохода в модели общего равновесия. Для анализа номинального экспорта отдельной товарной группы применим прежде всего этот механизм; численные оценки авторов характеризуют другую экономическую величину.</w:t>
       </w:r>
       <w:r>
         <w:rPr>
@@ -599,12 +716,24 @@
     </w:p>
     <w:p>
       <w:r>
+        <w:t>На уровне фирм значение географического разнообразия зависит и от постоянства торговых связей. Vannoorenberghe, Wang и Yu обнаруживают, что среди небольших китайских экспортеров более разнообразной географии соответствует более высокая волатильность, тогда как среди крупных связь обратная. В предложенной модели фиксированные издержки выхода на рынок и краткосрочные шоки спроса делают часть поставок малых фирм эпизодическими. Таким образом, расширение набора направлений может менять сам характер колебаний. Фирменный механизм не переносится автоматически на агрегированный экспорт страны, но показывает границы предположения о неизменных рисках при смене структуры.</w:t>
+      </w:r>
+      <w:r>
+        <w:rPr>
+          <w:rStyle w:val="FootnoteReference"/>
+        </w:rPr>
+        <w:footnoteReference w:id="16"/>
+      </w:r>
+      <w:r/>
+    </w:p>
+    <w:p>
+      <w:r>
         <w:t>Для полупроводников дополнительную роль играют общие источники спроса. Если несколько стран участвуют в изготовлении продукции для одного конечного рынка, их импорт компонентов может одновременно реагировать на его спад. Число непосредственных покупателей при этом превышает число независимых источников спроса. Аналогично падение мировых цен на память способно затронуть поставки одного экспортера во множество государств. Поэтому географическая диверсификация внутри товарной категории должна рассматриваться совместно с ее отраслевыми свойствами, а не как отдельная характеристика числа партнеров.</w:t>
       </w:r>
     </w:p>
     <w:p>
       <w:r>
-        <w:t>Специализация и диверсификация также связаны с разными экономическими целями. Сокращение исторической дисперсии не обязательно сопровождается ростом средней выручки, прибыльности или производительности. Переход к менее волатильному сегменту может требовать инвестиций и освоения новых технологий. Из наблюдаемой структуры экспорта нельзя определить издержки такого перехода. Поэтому оценка связи весов с волатильностью дает характеристику структуры при заданных условиях и сама по себе не устанавливает оптимальную промышленную политику.</w:t>
+        <w:t>Стабильность представляет только одну из характеристик экспортной структуры. Сокращение дисперсии не обязательно сопровождается ростом средней выручки, прибыльности или производительности. Освоение менее волатильного сегмента требует ресурсов, а специализация может приносить выгоды от масштаба и накопленных компетенций. Портфельная оценка экспортных долей поэтому используется для измерения исторической изменчивости, без отождествления минимальной дисперсии с оптимальной промышленной политикой.</w:t>
       </w:r>
     </w:p>
     <w:p>
@@ -612,7 +741,53 @@
         <w:keepNext/>
       </w:pPr>
       <w:r>
-        <w:t>Для разделения двух измерений доля ячейки представляется произведением товарной и условной географической долей:</w:t>
+        <w:t xml:space="preserve">Для разделения товарного и географического измерений обозначим через </w:t>
+      </w:r>
+      <m:oMath>
+        <m:sSub>
+          <m:e>
+            <m:r>
+              <m:rPr>
+                <m:sty m:val="i"/>
+              </m:rPr>
+              <m:t>a</m:t>
+            </m:r>
+          </m:e>
+          <m:sub>
+            <m:r>
+              <m:rPr>
+                <m:sty m:val="i"/>
+              </m:rPr>
+              <m:t>k</m:t>
+            </m:r>
+          </m:sub>
+        </m:sSub>
+      </m:oMath>
+      <w:r>
+        <w:t xml:space="preserve"> долю категории k в экспорте, а через </w:t>
+      </w:r>
+      <m:oMath>
+        <m:sSub>
+          <m:e>
+            <m:r>
+              <m:rPr>
+                <m:sty m:val="i"/>
+              </m:rPr>
+              <m:t>b</m:t>
+            </m:r>
+          </m:e>
+          <m:sub>
+            <m:r>
+              <m:rPr>
+                <m:sty m:val="i"/>
+              </m:rPr>
+              <m:t>j|k</m:t>
+            </m:r>
+          </m:sub>
+        </m:sSub>
+      </m:oMath>
+      <w:r>
+        <w:t xml:space="preserve"> — долю направления j в поставках этой категории. При положительном суммарном экспорте каждой категории доля ячейки представляется произведением:</w:t>
       </w:r>
     </w:p>
     <w:p>
@@ -630,7 +805,7 @@
             <m:e>
               <m:r>
                 <m:rPr>
-                  <m:sty m:val="p"/>
+                  <m:sty m:val="i"/>
                 </m:rPr>
                 <m:t>w</m:t>
               </m:r>
@@ -638,7 +813,7 @@
             <m:sub>
               <m:r>
                 <m:rPr>
-                  <m:sty m:val="p"/>
+                  <m:sty m:val="i"/>
                 </m:rPr>
                 <m:t>k,j</m:t>
               </m:r>
@@ -654,7 +829,7 @@
             <m:e>
               <m:r>
                 <m:rPr>
-                  <m:sty m:val="p"/>
+                  <m:sty m:val="i"/>
                 </m:rPr>
                 <m:t>a</m:t>
               </m:r>
@@ -662,7 +837,7 @@
             <m:sub>
               <m:r>
                 <m:rPr>
-                  <m:sty m:val="p"/>
+                  <m:sty m:val="i"/>
                 </m:rPr>
                 <m:t>k</m:t>
               </m:r>
@@ -678,7 +853,7 @@
             <m:e>
               <m:r>
                 <m:rPr>
-                  <m:sty m:val="p"/>
+                  <m:sty m:val="i"/>
                 </m:rPr>
                 <m:t>b</m:t>
               </m:r>
@@ -686,7 +861,7 @@
             <m:sub>
               <m:r>
                 <m:rPr>
-                  <m:sty m:val="p"/>
+                  <m:sty m:val="i"/>
                 </m:rPr>
                 <m:t>j|k</m:t>
               </m:r>
@@ -718,7 +893,7 @@
                 <m:e>
                   <m:r>
                     <m:rPr>
-                      <m:sty m:val="p"/>
+                      <m:sty m:val="i"/>
                     </m:rPr>
                     <m:t>a</m:t>
                   </m:r>
@@ -726,7 +901,7 @@
                 <m:sub>
                   <m:r>
                     <m:rPr>
-                      <m:sty m:val="p"/>
+                      <m:sty m:val="i"/>
                     </m:rPr>
                     <m:t>k</m:t>
                   </m:r>
@@ -760,7 +935,7 @@
                 <m:e>
                   <m:r>
                     <m:rPr>
-                      <m:sty m:val="p"/>
+                      <m:sty m:val="i"/>
                     </m:rPr>
                     <m:t>b</m:t>
                   </m:r>
@@ -768,7 +943,7 @@
                 <m:sub>
                   <m:r>
                     <m:rPr>
-                      <m:sty m:val="p"/>
+                      <m:sty m:val="i"/>
                     </m:rPr>
                     <m:t>j|k</m:t>
                   </m:r>
@@ -787,12 +962,12 @@
     </w:p>
     <w:p>
       <w:r>
-        <w:t>Такое представление позволяет различать изменение товарных долей aₖ и изменение условных географических долей bⱼ₍ₖ₎. Например, совокупная доля страны-покупателя может уменьшиться вследствие сокращения веса памяти, даже если география самой памяти осталась прежней. При рассмотрении только общего распределения по странам этот механизм теряется. В настоящей работе факторизация используется для сопоставления двух наблюдаемых структур на одной истории совместных колебаний.</w:t>
+        <w:t>Сумма географических долей равна единице отдельно внутри каждой категории. Такое представление позволяет различать изменение товарных весов и перераспределение направлений при заданном товарном составе. Например, совокупная доля страны-покупателя может уменьшиться вследствие сокращения веса памяти, даже если география самой памяти осталась прежней. Географический вклад в дальнейших расчетах относится именно к изменению распределений внутри товарных категорий. Он не совпадает по определению с изменением совокупной доли отдельной страны.</w:t>
       </w:r>
     </w:p>
     <w:p>
       <w:r>
-        <w:t>Следовательно, концентрация и волатильность являются связанными, но самостоятельными характеристиками экспорта. Первая описывает распределение поставок, вторая — изменчивость их стоимости. Теоретически обоснованное сопоставление требует сохранить товарное измерение, учитывать ковариации и отдельно оценивать изменения географии внутри категорий. Это позволяет проверить, сопровождается ли более равномерная структура меньшими условными колебаниями и какие изменения весов формируют полученную разницу.</w:t>
+        <w:t>Теоретический анализ связывает диверсификацию с волатильностью через изменение весов потоков, различия их собственных дисперсий и ковариации. Общий отраслевой цикл способен ограничивать выгоды от расширения географии, тогда как товарный сдвиг меняет экспозицию к этому циклу. Раздельное измерение двух структурных изменений позволяет установить, усиливают ли они друг друга или частично компенсируются.</w:t>
       </w:r>
     </w:p>
     <w:p>
@@ -805,29 +980,12 @@
     </w:p>
     <w:p>
       <w:r>
-        <w:t>Исследования по рассматриваемой теме различаются прежде всего измеряемым результатом. Одни анализируют изменчивость выпуска или дохода, другие — рост экспортной выручки, конкурентоспособность либо устойчивость торговой сети. Выбор показателя определяет и требования к данным. Годовые доли подходят для описания структуры; для оценки совместных колебаний необходимы временные ряды; установление причинного воздействия внешнего шока требует дополнительных предпосылок идентификации. Поэтому сходство используемых слов «диверсификация» и «устойчивость» еще не означает совпадения исследовательских задач.</w:t>
+        <w:t>Эмпирические работы уточняют условия, при которых диверсификация сопровождается более устойчивой динамикой. Их результаты следует сопоставлять с учетом измеряемого показателя и уровня агрегации. Сокращение экспорта во время кризиса характеризует реакцию на отдельный эпизод, дисперсия темпов — разброс наблюдений за период, а показатели торговой сети — распределение связей и зависимостей. Для постановки настоящего исследования необходимо установить, какие стороны структурных изменений раскрывает каждый подход.</w:t>
       </w:r>
     </w:p>
     <w:p>
       <w:r>
-        <w:t>Отдельную группу составляют работы о реакции экспорта на кризис. Lee и Yu используют годовые данные по 24 отраслям обрабатывающей промышленности Кореи за 2000–2016 годы. В модели с фиксированными эффектами они сопоставляют товарную и страновую диверсификацию и рассматривают кризис 2009 года. Авторы находят связь географического разнообразия с менее выраженным сокращением экспорта, тогда как для товарной диверсификации аналогичный результат в их спецификации не получен. Это важный пример того, что два измерения структуры могут давать разные эмпирические результаты даже в рамках одной страны.</w:t>
-      </w:r>
-      <w:r>
-        <w:rPr>
-          <w:rStyle w:val="FootnoteReference"/>
-        </w:rPr>
-        <w:footnoteReference w:id="16"/>
-      </w:r>
-      <w:r/>
-    </w:p>
-    <w:p>
-      <w:r>
-        <w:t>Исследование Lee и Yu не дает универсального ранжирования двух видов диверсификации. Его вывод относится к определенному кризису, отраслевому уровню агрегации и выбранной модели. Внутри интегральных схем различия между типами продукции могут проявляться иначе, чем между широкими отраслями. Кроме того, глубина падения в одном эпизоде и дисперсия темпов на многолетнем интервале характеризуют разные стороны нестабильности. Сопоставление с этой работой полезно для постановки вопроса, но не заменяет самостоятельной отраслевой проверки.</w:t>
-      </w:r>
-    </w:p>
-    <w:p>
-      <w:r>
-        <w:t>В структурном исследовании Esposito центральное место занимает пространственная зависимость колебаний спроса. На фирменных данных Португалии автор рассматривает выбор направлений экспорта в условиях риска и связывает возможности диверсификации с совместной динамикой рынков. Для настоящей работы это один из основных теоретических ориентиров при использовании ковариаций. Вместе с тем структурно выделенные шоки спроса отличаются от наблюдаемых темпов экспорта: последние одновременно отражают спрос, предложение, цены и решения фирм.</w:t>
+        <w:t>На отраслевом уровне Lee и Yu изучают годовые данные по 24 отраслям обрабатывающей промышленности Кореи за 2000–2016 годы. В модели с фиксированными эффектами более высокая страновая диверсификация связана с меньшим сокращением экспорта во время кризиса 2009 года. Для товарной диверсификации и выявленных сравнительных преимуществ аналогичный результат в их спецификации не получен. Различие между двумя видами диверсификации тем самым имеет эмпирическое основание. Однако глубина падения в одном кризисе не равнозначна волатильности на всем интервале, а категории внутри интегральных схем существенно уже отраслей обрабатывающей промышленности.</w:t>
       </w:r>
       <w:r>
         <w:rPr>
@@ -839,7 +997,7 @@
     </w:p>
     <w:p>
       <w:r>
-        <w:t>Более новое исследование Hong и соавторов посвящено китайским экспортерам во время мирового торгового спада 2008–2009 годов. Авторы объединяют таможенную и финансовую информацию и используют различия внешнего спроса, построенные с учетом докризисной географии фирм, при оценке производительности и прибыльности. Диверсификация рассматривается как условие, способное смягчить неблагоприятное воздействие. Эта постановка иллюстрирует требования к причинному анализу: необходимы данные и обоснование источника внешней вариации, выходящие за пределы сопоставления экспортных долей.</w:t>
+        <w:t>Исследования фирм позволяют подробнее рассмотреть механизм передачи внешнего спроса. Hong и соавторы объединяют таможенные и финансовые данные китайских публичных компаний за 2005–2012 годы. Они используют рост ВВП стран назначения, взвешенный по докризисным экспортным долям, как инструмент для изменения экспорта при оценке производительности и прибыльности. Работа связывает диверсификацию с меньшими потерями во время мирового торгового спада. Такая интерпретация опирается на предпосылки об экзогенности внешнего спроса и его связи с результатами фирмы через экспорт. Само наличие наблюдений до и после кризиса этих предпосылок не заменяет.</w:t>
       </w:r>
       <w:r>
         <w:rPr>
@@ -851,7 +1009,7 @@
     </w:p>
     <w:p>
       <w:r>
-        <w:t>Иной способ изучения совместных колебаний представлен у Barigozzi и соавторов. В работе используются французские экспортные транзакции за 1993–2017 годы и динамическая факторная модель, позволяющая выделять общие и связанные с направлениями компоненты. Для рассматриваемой темы существенно, что разложение экспортной волатильности и анализ географической диверсификации уже являются разработанными направлениями литературы. Применение ковариационной матрицы к отраслевым потокам следует позиционировать как более узкую эмпирическую постановку, а не создание нового общего подхода.</w:t>
+        <w:t>В модели Esposito географическое распределение продаж является результатом выбора фирм в условиях риска. Возможности диверсификации зависят от ковариации спроса между рынками; эмпирическая часть использует данные португальских предприятий. Эта постановка объясняет, почему один и тот же рынок может иметь разное значение для экспортеров с различным набором остальных направлений. Она также показывает, что экспортные доли сами реагируют на ожидаемые риски и издержки выхода на рынок. Поэтому наблюдаемая связь долей и волатильности без дополнительных условий не определяет причинное воздействие диверсификации.</w:t>
       </w:r>
       <w:r>
         <w:rPr>
@@ -863,7 +1021,7 @@
     </w:p>
     <w:p>
       <w:r>
-        <w:t>Отраслевая литература позволяет уточнить, какие особенности полупроводников уже исследованы. Shin и Shin используют корейские торговые микроданные за отдельные годы 2010–2020 и рассматривают память, системные полупроводники, оборудование и части. Сочетание анализа потоков, визуализации и байесовской сети раскрывает товарные и логистические связи. Авторы отмечают значение развития сегментов вне памяти. Таким образом, высокая специализация Кореи на памяти и необходимость учитывать разные участки цепочки установлены до настоящего исследования.</w:t>
+        <w:t>Barigozzi и соавторы исследуют совместные колебания французских экспортных транзакций за 1993–2017 годы с помощью динамической факторной модели. На квартальных данных по сочетаниям фирмы и страны назначения выделяются общий, специфический для направления и индивидуальный компоненты. Результаты показывают неодинаковую связь географической диверсификации с этими составляющими волатильности: сглаживание общих колебаний не означает такого же изменения индивидуальной части. Этот подход разделяет источники совместной динамики. В настоящем исследовании решается иной, более узкий вопрос: как меняется дисперсия при замене товарных и географических весов на неизменной истории потоков.</w:t>
       </w:r>
       <w:r>
         <w:rPr>
@@ -875,7 +1033,12 @@
     </w:p>
     <w:p>
       <w:r>
-        <w:t>В работе Koo рассмотрены корейские потоки за 2015–2025 годы по памяти, прочим интегральным схемам и полупроводниковым пластинам. Автор сопоставляет экспорт, импорт и концентрацию направлений. Содержательный результат заключается в неодинаковом характере изменений разных товарных групп в условиях общей перестройки цепочек. Использование этого исследования позволяет избежать слишком широкого вывода о едином направлении диверсификации всей отрасли. При этом предмет настоящей работы уже по товарным границам и дополнен сравнением двух экспортеров и оценкой совместных месячных колебаний.</w:t>
+        <w:t>Сопоставление этих работ позволяет разграничить объяснение происхождения шоков и оценку экспозиции к уже наблюдавшимся колебаниям. Структурная модель спроса, инструментальные переменные и факторная модель требуют разных данных и идентифицирующих предпосылок. Ковариационная оценка зарегистрированного экспорта объединяет изменения спроса, предложения, цен и состава продукции. Ее достоинство для поставленной задачи заключается в возможности применить к одной истории несколько точно определенных структур. Это позволяет количественно отделить изменение весов от смены самого исторического окна.</w:t>
+      </w:r>
+    </w:p>
+    <w:p>
+      <w:r>
+        <w:t>Отраслевая литература показывает, почему такое сравнение должно сохранять товарную детализацию. Shin и Shin исследуют корейские торговые потоки, различая память, системные полупроводники, оборудование и части; они сочетают анализ потоков с байесовской сетью. Koo на данных UN Comtrade за 2015–2025 годы сопоставляет память, прочие интегральные схемы и полупроводниковые пластины. Изменения концентрации и направлений в этих сегментах неодинаковы. Обобщение на всю полупроводниковую отрасль может поэтому скрывать противоположные сдвиги отдельных категорий. Вместе с тем используемые границы шире четырех категорий интегральных схем, выбранных в настоящей работе.</w:t>
       </w:r>
       <w:r>
         <w:rPr>
@@ -883,11 +1046,15 @@
         </w:rPr>
         <w:footnoteReference w:id="21"/>
       </w:r>
-      <w:r/>
-    </w:p>
-    <w:p>
       <w:r>
-        <w:t>Сравнение Японии и Республики Корея также встречается в существующей литературе. Kitetu, Mbante II и Ko оценивают конкурентоспособность и взаимодополняемость торговли, в том числе на уровне шестизначных товарных кодов. Основное внимание уделяется показателям выявленных сравнительных преимуществ и торговой взаимодополняемости. Следовательно, сам выбор двух стран или подробной классификации не составляет самостоятельного исследовательского вклада. Отличие необходимо связывать с оцениваемой величиной и способом объяснения структурного изменения.</w:t>
+        <w:rPr>
+          <w:rFonts w:ascii="Times New Roman" w:hAnsi="Times New Roman"/>
+          <w:b w:val="0"/>
+          <w:color w:val="000000"/>
+          <w:sz w:val="18"/>
+          <w:vertAlign w:val="superscript"/>
+        </w:rPr>
+        <w:t>,</w:t>
       </w:r>
       <w:r>
         <w:rPr>
@@ -899,7 +1066,7 @@
     </w:p>
     <w:p>
       <w:r>
-        <w:t>Для США Yu и Yu рассматривают экспорт интегральных схем за 2015–2024 годы с использованием HHI и показателя выявленных сравнительных преимуществ. Такая работа дает пример описания изменений товарной и географической структуры другого крупного участника отрасли. Однако отношение экспортных долей к конкурентоспособности и отношение весов к исторической дисперсии представляют разные вопросы. Индексы специализации полезны для характеристики положения страны, но не определяют совместную динамику ее торговых потоков.</w:t>
+        <w:t>Показатели конкурентоспособности и изменения экспортной стоимости отвечают на смежные вопросы. Kitetu, Mbante II и Ko сопоставляют Корею и Японию с помощью индексов сравнительных преимуществ и торговой взаимодополняемости, включая шестизначные категории интегральных схем. Yu и Yu используют HHI и выявленные сравнительные преимущества для экспорта США за 2015–2024 годы. В работе Hong к корейским поставкам на основные рынки применяется модель постоянных рыночных долей. Эти постановки характеризуют специализацию и изменение объемов стоимостной торговли. Переход к дисперсии месячных темпов требует отдельно учитывать совместную динамику составляющих потоков.</w:t>
       </w:r>
       <w:r>
         <w:rPr>
@@ -907,11 +1074,15 @@
         </w:rPr>
         <w:footnoteReference w:id="23"/>
       </w:r>
-      <w:r/>
-    </w:p>
-    <w:p>
       <w:r>
-        <w:t>В исследованиях Kim и Lee концентрация корейской полупроводниковой торговли рассматривается совместно с энтропийными и сетевыми характеристиками. По доступной аннотации работа относится к измерению зависимости и устойчивости структуры. Hong анализирует изменение экспорта на основные рынки с использованием подхода постоянных рыночных долей. Отдельная работа Kim посвящена такому разложению корейского промышленного экспорта в Китай. Эти подходы помогают изучать структуру и изменение экспортной стоимости, однако их результаты нельзя автоматически считать оценками дисперсии месячных темпов.</w:t>
+        <w:rPr>
+          <w:rFonts w:ascii="Times New Roman" w:hAnsi="Times New Roman"/>
+          <w:b w:val="0"/>
+          <w:color w:val="000000"/>
+          <w:sz w:val="18"/>
+          <w:vertAlign w:val="superscript"/>
+        </w:rPr>
+        <w:t>,</w:t>
       </w:r>
       <w:r>
         <w:rPr>
@@ -935,6 +1106,18 @@
         </w:rPr>
         <w:footnoteReference w:id="25"/>
       </w:r>
+      <w:r/>
+    </w:p>
+    <w:p>
+      <w:r>
+        <w:t>Не следует отождествлять и различные значения устойчивости. В аннотации Kim и Lee описано совместное использование концентрации, энтропии и сетевых показателей на данных корейской полупроводниковой торговли за 2013, 2018 и 2023 годы. У Kim и Park экспортный портфель Кореи за 1988–2017 годы рассматривается с помощью HHI, коэффициента Шарпа и Value-at-Risk. Эти работы подтверждают наличие исследований зависимости и риска в близкой предметной области. Поскольку здесь доступны только их аннотации, сопоставление ограничивается заявленными данными и методами; на них не основывается утверждение об отсутствии аналогичных расчетов.</w:t>
+      </w:r>
+      <w:r>
+        <w:rPr>
+          <w:rStyle w:val="FootnoteReference"/>
+        </w:rPr>
+        <w:footnoteReference w:id="26"/>
+      </w:r>
       <w:r>
         <w:rPr>
           <w:rFonts w:ascii="Times New Roman" w:hAnsi="Times New Roman"/>
@@ -949,35 +1132,13 @@
         <w:rPr>
           <w:rStyle w:val="FootnoteReference"/>
         </w:rPr>
-        <w:footnoteReference w:id="26"/>
-      </w:r>
-      <w:r/>
-    </w:p>
-    <w:p>
-      <w:r>
-        <w:t>Связь экспортной концентрации с финансовыми мерами риска также не является новой темой. В работе Kim и Park уже объединяются HHI, коэффициенты концентрации, коэффициент Шарпа и Value-at-Risk применительно к корейскому экспорту. Доступная аннотация подтверждает существование такой постановки, хотя не позволяет детально сопоставить все расчеты. Поэтому исследовательское отличие настоящей работы формулируется конкретнее: отдельно рассматриваются товарные доли и география внутри категорий в единой ковариационной оценке.</w:t>
-      </w:r>
-      <w:r>
-        <w:rPr>
-          <w:rStyle w:val="FootnoteReference"/>
-        </w:rPr>
         <w:footnoteReference w:id="27"/>
       </w:r>
       <w:r/>
     </w:p>
     <w:p>
       <w:r>
-        <w:t>При измерении волатильности принципиален выбор исходного ряда. Стандартное отклонение уровней экспортной стоимости чувствительно к масштабу страны и долгосрочному росту. Использование темпов изменения позволяет перейти к относительным колебаниям. Месячные данные дают более подробную динамику, но содержат сезонность и нерегулярные поставки. Годовые темпы по месячным наблюдениям уменьшают значение устойчивой сезонной структуры, сохраняя зависимость соседних наблюдений. Эти свойства должны учитываться при построении интервалов и выборе проверок устойчивости результата.</w:t>
-      </w:r>
-    </w:p>
-    <w:p>
-      <w:r>
-        <w:t>В настоящем исследовании необходимо различать фактический темп совокупного экспорта и условный индекс с фиксированными весами. В фактическом ряду доли составляющих меняются во времени. В условном индексе одна наблюдаемая структура применяется ко всей общей истории темпов ячеек. Сопоставление двух наборов весов при одной ковариационной матрице позволяет определить, как изменяется рассчитанная дисперсия вследствие замены структуры. Такой расчет характеризует историческую экспозицию к наблюдавшимся колебаниям; он не воспроизводит буквальный сценарий переноса производства и продаж.</w:t>
-      </w:r>
-    </w:p>
-    <w:p>
-      <w:r>
-        <w:t>Если одновременно меняются товарные доли и география внутри категорий, результат последовательной замены факторов может зависеть от порядка. Для симметричного распределения общей разницы используется известный принцип Шепли. Shorrocks показывает, как усреднение предельных вкладов по возможным последовательностям замен позволяет получить согласованное разложение. При двух факторах учитываются оба порядка. Полученные вклады складываются в изменение выбранной функции, в данном случае дисперсии. Это способ атрибуции результата при заданной модели.</w:t>
+        <w:t>Наиболее близкий содержательный ориентир дает исследование Jo и Jung. Помимо объяснения колебаний цен на память, авторы рассчитывают изменение корейского экспорта в первом квартале 2023 года при замене соотношения памяти и остальных полупроводников на среднемировое. Темпы изменения двух сегментов при этом фиксируются. Следовательно, сценарное перевзвешивание товарного состава уже применяется в отраслевой литературе. Отличие настоящей постановки заключается в переходе от падения за один эпизод к дисперсии на общем историческом интервале и в одновременном рассмотрении географии внутри товарных категорий.</w:t>
       </w:r>
       <w:r>
         <w:rPr>
@@ -989,17 +1150,61 @@
     </w:p>
     <w:p>
       <w:r>
-        <w:t>Стандартное отклонение удобно для представления масштаба колебаний, поскольку имеет те же единицы, что и темп. Однако аддитивные вклады в изменение дисперсии нельзя напрямую складывать как вклады в стандартное отклонение. Интервалы характеризуют неопределенность конкретного расчета. Дополнительные исторические окна и иной состав категорий позволяют проверить чувствительность результата к этим решениям.</w:t>
+        <w:t>Банк Кореи, в свою очередь, сопоставляет распределения годовых темпов экспорта Кореи, Японии и Тайваня и рассматривает зависимость от конечного спроса. Этот анализ связывает различия колебаний с высокой долей памяти и особенностями применения чипов. Таким образом, сравнение стран и значение памяти уже имеют прямых предшественников. Дальнейшее развитие вопроса состоит в количественном разделении товарного и географического изменений при одинаковом способе расчета, с учетом их взаимодействия и неопределенности оценки.</w:t>
+      </w:r>
+      <w:r>
+        <w:rPr>
+          <w:rStyle w:val="FootnoteReference"/>
+        </w:rPr>
+        <w:footnoteReference w:id="29"/>
+      </w:r>
+      <w:r/>
+    </w:p>
+    <w:p>
+      <w:r>
+        <w:t>В рассмотренной литературе сформированы необходимые теоретические и отраслевые основания исследования, но разные подходы объясняют разные величины. Показатели концентрации описывают распределение долей, сценарий KDI — вклад состава продукции в конкретное падение, факторное разложение — источники колебаний. Задача настоящей работы связывает эти направления на уровне товарно-географических потоков: определить, какую разницу в условной дисперсии дают наблюдаемые изменения товарных долей и географии внутри категорий, как собственные дисперсии и ковариации формируют эту разницу и сохраняется ли ее направление в разных исторических условиях. Это конкретный прикладной вопрос, выходящий за пределы обновления периода описательной статистики.</w:t>
       </w:r>
     </w:p>
     <w:p>
       <w:r>
-        <w:t>Исследовательский вопрос состоит в том, как изменения товарной структуры и географии экспорта интегральных схем Японии и Республики Корея между 2017 и 2024 годами связаны с условной исторической волатильностью его стоимости. Теория допускает неодинаковые товарный и географический вклады при снижении концентрации. Их направление и величина должны определяться данными. Роль памяти рассматривается с учетом уже установленных в литературе отраслевых особенностей.</w:t>
+        <w:t>Объектом исследования выступает экспорт интегральных схем Японии и Республики Корея, предметом — связь его товарной и географической структуры с исторической волатильностью номинальной стоимости в долларах США. Сопоставляются структуры 2017 и 2024 годов на месячных данных за 2017–2024 годы. Для сравнения с соответствующим месяцем предыдущего года используются наблюдения 2018–2024 годов. Выбор относительных изменений устраняет прямую зависимость показателя от масштаба экспортера, хотя не исключает влияния цен и валютной переоценки.</w:t>
       </w:r>
     </w:p>
     <w:p>
       <w:r>
-        <w:t>Вклад работы состоит в сопоставлении двух экспортеров при одинаковых товарных границах и раздельной оценке двух видов структурных изменений на общей для каждого экспортера истории. Показатели концентрации дополняются учетом ковариаций. Во второй главе рассматриваются данные и фактическая динамика поставок, в третьей — условная модель, разложение вкладов и чувствительность оценок.</w:t>
+        <w:t>В основном расчете применяется симметричный темп изменения: разность текущей стоимости и стоимости годом ранее делится на их среднее. При неотрицательных стоимостях и положительном знаменателе он ограничен интервалом от −2 до 2 и позволяет учесть появление или прекращение поставок без неограниченного роста показателя из-за малой базы. Он отличается от обычного процентного темпа, поэтому определение роста остается частью интерпретации результата и проверки чувствительности. Пропущенное наблюдение не отождествляется с нулевой поставкой.</w:t>
+      </w:r>
+    </w:p>
+    <w:p>
+      <w:r>
+        <w:t>Из темпов отдельных ячеек строится индекс с фиксированными весами. Одна наблюдаемая структура применяется ко всей истории, после чего расчет повторяется с другой структурой при той же ковариационной матрице. Слово «условная» означает здесь фиксацию весов и выбранной истории колебаний. Такой показатель отличается от фактического темпа совокупного экспорта, для агрегирования которого требуются меняющиеся во времени веса. Он не является прогнозом условной дисперсии на следующий месяц. Ковариационная матрица оценивается отдельно для каждой страны; сравнение изменений внутри стран поэтому не предполагает тождества их ценовых циклов и производственных условий.</w:t>
+      </w:r>
+    </w:p>
+    <w:p>
+      <w:r>
+        <w:t>Одновременная замена товарных долей и географии может давать разные промежуточные результаты в зависимости от очередности. Принцип Шепли позволяет усреднить предельный вклад каждого фактора по двум порядкам замены. Как показано у Shorrocks, такой подход обеспечивает точное аддитивное разложение. В данной работе товарный и географический вклады складываются в изменение дисперсии, распределяя между собой взаимодействие факторов. Полученное разложение относится к выбранному представлению структуры и фиксированной ковариационной матрице.</w:t>
+      </w:r>
+      <w:r>
+        <w:rPr>
+          <w:rStyle w:val="FootnoteReference"/>
+        </w:rPr>
+        <w:footnoteReference w:id="30"/>
+      </w:r>
+      <w:r/>
+    </w:p>
+    <w:p>
+      <w:r>
+        <w:t>Для представления масштаба колебаний используется стандартное отклонение, выраженное в процентных пунктах; аддитивные вклады в дисперсию имеют размерность квадрата процентных пунктов. Их нельзя напрямую складывать как вклады в стандартное отклонение. Интервалы оцениваются с сохранением временной зависимости наблюдений при фиксированных весах. Проверки на разных исторических окнах нужны потому, что общий отраслевой цикл и синхронность потоков могут меняться. Сопоставимость результата также требует проверки товарного охвата, объединения направлений и определения темпа.</w:t>
+      </w:r>
+    </w:p>
+    <w:p>
+      <w:r>
+        <w:t>Экономическая интерпретация ограничена наблюдаемой стоимостной структурой. Сдвиг веса памяти может отражать цены и изменение состава изделий внутри кода; перемещение направления поставки может сохранять прежний конечный спрос. Реальная переориентация производства способна, кроме того, изменить сами темпы и ковариации. Поэтому историческое перевзвешивание дает оценку экспозиции к наблюдавшимся колебаниям, а причинный эффект торговых ограничений или осуществимой промышленной политики потребовал бы другой модели.</w:t>
+      </w:r>
+    </w:p>
+    <w:p>
+      <w:r>
+        <w:t>Цель исследования состоит в оценке и объяснении изменения условной исторической волатильности при переходе от экспортной структуры 2017 года к структуре 2024 года. Эмпирический анализ устанавливает, совпадают ли направления изменения концентрации и волатильности, как соотносятся товарный и географический вклады и насколько их интерпретация зависит от исторического окна. Исследовательский вклад заключается в сопоставимом расчете для двух экспортеров, точной атрибуции структурных изменений и объяснении роли ковариаций внутри отрасли. Во второй главе рассматриваются данные и фактическая структура поставок, в третьей — модель, оценки вкладов и проверки их устойчивости.</w:t>
       </w:r>
     </w:p>
     <w:p>
@@ -1013,7 +1218,7 @@
     </w:p>
     <w:p>
       <w:pPr>
-        <w:spacing w:line="276" w:lineRule="auto" w:after="120"/>
+        <w:spacing w:line="276" w:lineRule="auto" w:after="60"/>
         <w:ind w:hanging="397" w:left="397"/>
       </w:pPr>
       <w:r>
@@ -1022,7 +1227,7 @@
     </w:p>
     <w:p>
       <w:pPr>
-        <w:spacing w:line="276" w:lineRule="auto" w:after="120"/>
+        <w:spacing w:line="276" w:lineRule="auto" w:after="60"/>
         <w:ind w:hanging="397" w:left="397"/>
       </w:pPr>
       <w:r>
@@ -1031,34 +1236,34 @@
     </w:p>
     <w:p>
       <w:pPr>
-        <w:spacing w:line="276" w:lineRule="auto" w:after="120"/>
+        <w:spacing w:line="276" w:lineRule="auto" w:after="60"/>
         <w:ind w:hanging="397" w:left="397"/>
       </w:pPr>
       <w:r>
-        <w:t>3. Cadot O.; Carrère C.; Strauss-Kahn V. (2013). Trade Diversification, Income, and Growth: What Do We Know? Journal of Economic Surveys 27(4), 790–812. DOI: 10.1111/j.1467-6419.2011.00719.x.</w:t>
+        <w:t>3. Cadot O.; Carrère C.; Strauss-Kahn V. (2013). Trade Diversification, Income, and Growth: What Do We Know? Journal of Economic Surveys 27(4), 790–812. DOI: 10.1111/j.1467-6419.2011.00719.x. Использованная версия: Cadot O.; Carrère C.; Strauss-Kahn V. (2011). Trade Diversification, Income, and Growth: What Do We Know? FERDI Working Paper P33, November.</w:t>
       </w:r>
     </w:p>
     <w:p>
       <w:pPr>
-        <w:spacing w:line="276" w:lineRule="auto" w:after="120"/>
+        <w:spacing w:line="276" w:lineRule="auto" w:after="60"/>
         <w:ind w:hanging="397" w:left="397"/>
       </w:pPr>
       <w:r>
-        <w:t>4. Caselli F.; Koren M.; Lisicky M.; Tenreyro S. (2020). Diversification through Trade. Quarterly Journal of Economics 135(1), 449–502. DOI: 10.1093/qje/qjz028.</w:t>
+        <w:t>4. Caselli F.; Koren M.; Lisicky M.; Tenreyro S. (2020). Diversification through Trade. Quarterly Journal of Economics 135(1), 449–502. DOI: 10.1093/qje/qjz028. Использованная версия: Caselli F.; Koren M.; Lisicky M.; Tenreyro S. (2019). Diversification through Trade. Author manuscript, June.</w:t>
       </w:r>
     </w:p>
     <w:p>
       <w:pPr>
-        <w:spacing w:line="276" w:lineRule="auto" w:after="120"/>
+        <w:spacing w:line="276" w:lineRule="auto" w:after="60"/>
         <w:ind w:hanging="397" w:left="397"/>
       </w:pPr>
       <w:r>
-        <w:t>5. Esposito F. (2022). Demand risk and diversification through international trade. Journal of International Economics 135, 103562. DOI: 10.1016/j.jinteco.2021.103562.</w:t>
+        <w:t>5. Esposito F. (2022). Demand risk and diversification through international trade. Journal of International Economics 135, 103562. DOI: 10.1016/j.jinteco.2021.103562. Использованная версия: Esposito F. (2020). Demand Risk and Diversification through Trade. MPRA Paper 100398, May.</w:t>
       </w:r>
     </w:p>
     <w:p>
       <w:pPr>
-        <w:spacing w:line="276" w:lineRule="auto" w:after="120"/>
+        <w:spacing w:line="276" w:lineRule="auto" w:after="60"/>
         <w:ind w:hanging="397" w:left="397"/>
       </w:pPr>
       <w:r>
@@ -1067,7 +1272,7 @@
     </w:p>
     <w:p>
       <w:pPr>
-        <w:spacing w:line="276" w:lineRule="auto" w:after="120"/>
+        <w:spacing w:line="276" w:lineRule="auto" w:after="60"/>
         <w:ind w:hanging="397" w:left="397"/>
       </w:pPr>
       <w:r>
@@ -1076,7 +1281,7 @@
     </w:p>
     <w:p>
       <w:pPr>
-        <w:spacing w:line="276" w:lineRule="auto" w:after="120"/>
+        <w:spacing w:line="276" w:lineRule="auto" w:after="60"/>
         <w:ind w:hanging="397" w:left="397"/>
       </w:pPr>
       <w:r>
@@ -1085,7 +1290,7 @@
     </w:p>
     <w:p>
       <w:pPr>
-        <w:spacing w:line="276" w:lineRule="auto" w:after="120"/>
+        <w:spacing w:line="276" w:lineRule="auto" w:after="60"/>
         <w:ind w:hanging="397" w:left="397"/>
       </w:pPr>
       <w:r>
@@ -1094,7 +1299,7 @@
     </w:p>
     <w:p>
       <w:pPr>
-        <w:spacing w:line="276" w:lineRule="auto" w:after="120"/>
+        <w:spacing w:line="276" w:lineRule="auto" w:after="60"/>
         <w:ind w:hanging="397" w:left="397"/>
       </w:pPr>
       <w:r>
@@ -1103,7 +1308,7 @@
     </w:p>
     <w:p>
       <w:pPr>
-        <w:spacing w:line="276" w:lineRule="auto" w:after="120"/>
+        <w:spacing w:line="276" w:lineRule="auto" w:after="60"/>
         <w:ind w:hanging="397" w:left="397"/>
       </w:pPr>
       <w:r>
@@ -1112,146 +1317,137 @@
     </w:p>
     <w:p>
       <w:pPr>
-        <w:spacing w:line="276" w:lineRule="auto" w:after="120"/>
+        <w:spacing w:line="276" w:lineRule="auto" w:after="60"/>
         <w:ind w:hanging="397" w:left="397"/>
       </w:pPr>
       <w:r>
-        <w:t>12. Kim J. S. (2021). Research on CMS decomposition of South Korea’s manufacturing exports to China. IOP Conference Series: Earth and Environmental Science 791, 012170. DOI: 10.1088/1755-1315/791/1/012170.</w:t>
+        <w:t>12. Kim T.-H.; Lee M.-J. (2025). Assessing Trade Concentration, Dependency, and Resilience in Korea’s Semiconductor Supply Chain: A Network and Entropy-Based Approach. Journal of Korea Trade 29(7), 67–95. DOI: 10.35611/jkt.2025.29.7.67.</w:t>
       </w:r>
     </w:p>
     <w:p>
       <w:pPr>
-        <w:spacing w:line="276" w:lineRule="auto" w:after="120"/>
+        <w:spacing w:line="276" w:lineRule="auto" w:after="60"/>
         <w:ind w:hanging="397" w:left="397"/>
       </w:pPr>
       <w:r>
-        <w:t>13. Kim T.-H.; Lee M.-J. (2025). Assessing Trade Concentration, Dependency, and Resilience in Korea’s Semiconductor Supply Chain: A Network and Entropy-Based Approach. Journal of Korea Trade 29(7), 67–95. DOI: 10.35611/jkt.2025.29.7.67.</w:t>
+        <w:t>13. Kitetu G. M.; Mbante II A. R.; Ko J.-H. (2021). Revealed Trade Competitiveness between Korea and Japan. Is It Viable to Deepen Economic Integration? Journal of Global Business and Trade 17(2), 67–84. DOI: 10.20294/jgbt.2021.17.2.67.</w:t>
       </w:r>
     </w:p>
     <w:p>
       <w:pPr>
-        <w:spacing w:line="276" w:lineRule="auto" w:after="120"/>
+        <w:spacing w:line="276" w:lineRule="auto" w:after="60"/>
         <w:ind w:hanging="397" w:left="397"/>
       </w:pPr>
       <w:r>
-        <w:t>14. Kitetu G. M.; Mbante II A. R.; Ko J.-H. (2021). Revealed Trade Competitiveness between Korea and Japan. Is It Viable to Deepen Economic Integration? Journal of Global Business and Trade 17(2), 67–84. DOI: 10.20294/jgbt.2021.17.2.67.</w:t>
+        <w:t>14. Koh W. C. (2026). Tariffs, Tech Controls, and Techno-nationalism: Korea’s Semiconductor Industry in an Era of Sanctions and Strategic Competition. AMRO ACR-2026-03, Selected Issue 1.</w:t>
       </w:r>
     </w:p>
     <w:p>
       <w:pPr>
-        <w:spacing w:line="276" w:lineRule="auto" w:after="120"/>
+        <w:spacing w:line="276" w:lineRule="auto" w:after="60"/>
         <w:ind w:hanging="397" w:left="397"/>
       </w:pPr>
       <w:r>
-        <w:t>15. Koh W. C. (2026). Tariffs, Tech Controls, and Techno-nationalism: Korea’s Semiconductor Industry in an Era of Sanctions and Strategic Competition. AMRO ACR-2026-03, Selected Issue 1.</w:t>
+        <w:t>15. Koo J. H. (2026). Structural Changes in Korea’s Semiconductor Supply Chain under the Changing Economic Security Environment: An Analysis of Trade Structures, 2015–2025. Public Policy Review 40(2), 319–339. DOI: 10.17327/ippa.2026.40.2.011.</w:t>
       </w:r>
     </w:p>
     <w:p>
       <w:pPr>
-        <w:spacing w:line="276" w:lineRule="auto" w:after="120"/>
+        <w:spacing w:line="276" w:lineRule="auto" w:after="60"/>
         <w:ind w:hanging="397" w:left="397"/>
       </w:pPr>
       <w:r>
-        <w:t>16. Koo J. H. (2026). Structural Changes in Korea’s Semiconductor Supply Chain under the Changing Economic Security Environment: An Analysis of Trade Structures, 2015–2025. Public Policy Review 40(2), 319–339. DOI: 10.17327/ippa.2026.40.2.011.</w:t>
+        <w:t>16. Koren M.; Tenreyro S. (2007). Volatility and Development. Quarterly Journal of Economics 122(1), 243–287. DOI: 10.1162/qjec.122.1.243.</w:t>
       </w:r>
     </w:p>
     <w:p>
       <w:pPr>
-        <w:spacing w:line="276" w:lineRule="auto" w:after="120"/>
+        <w:spacing w:line="276" w:lineRule="auto" w:after="60"/>
         <w:ind w:hanging="397" w:left="397"/>
       </w:pPr>
       <w:r>
-        <w:t>17. Koren M.; Tenreyro S. (2007). Volatility and Development. Quarterly Journal of Economics 122(1), 243–287. DOI: 10.1162/qjec.122.1.243.</w:t>
+        <w:t>17. Lee J.; Yu B.-K. (2019). The Effects of Export Diversification on Macroeconomic Stabilization: Evidence from Korea. KDI Journal of Economic Policy 41(1), 1–14. DOI: 10.23895/kdijep.2019.41.1.1.</w:t>
       </w:r>
     </w:p>
     <w:p>
       <w:pPr>
-        <w:spacing w:line="276" w:lineRule="auto" w:after="120"/>
+        <w:spacing w:line="276" w:lineRule="auto" w:after="60"/>
         <w:ind w:hanging="397" w:left="397"/>
       </w:pPr>
       <w:r>
-        <w:t>18. Lee J.; Yu B.-K. (2019). The Effects of Export Diversification on Macroeconomic Stabilization: Evidence from Korea. KDI Journal of Economic Policy 41(1), 1–14. DOI: 10.23895/kdijep.2019.41.1.1.</w:t>
+        <w:t>18. Li L.; Wang H.; Li Z.; Hu S. (2025). Analysis of the structure and robustness of the global semiconductor trade network. PLOS ONE 20(1), e0313162. DOI: 10.1371/journal.pone.0313162.</w:t>
       </w:r>
     </w:p>
     <w:p>
       <w:pPr>
-        <w:spacing w:line="276" w:lineRule="auto" w:after="120"/>
+        <w:spacing w:line="276" w:lineRule="auto" w:after="60"/>
         <w:ind w:hanging="397" w:left="397"/>
       </w:pPr>
       <w:r>
-        <w:t>19. Li L.; Wang H.; Li Z.; Hu S. (2025). Analysis of the structure and robustness of the global semiconductor trade network. PLOS ONE 20(1), e0313162. DOI: 10.1371/journal.pone.0313162.</w:t>
+        <w:t>19. Markowitz H. (1952). Portfolio Selection. Journal of Finance 7(1), 77–91. DOI: 10.1111/j.1540-6261.1952.tb01525.x.</w:t>
       </w:r>
     </w:p>
     <w:p>
       <w:pPr>
-        <w:spacing w:line="276" w:lineRule="auto" w:after="120"/>
+        <w:spacing w:line="276" w:lineRule="auto" w:after="60"/>
         <w:ind w:hanging="397" w:left="397"/>
       </w:pPr>
       <w:r>
-        <w:t>20. Markowitz H. (1952). Portfolio Selection. Journal of Finance 7(1), 77–91. DOI: 10.1111/j.1540-6261.1952.tb01525.x.</w:t>
+        <w:t>20. OECD (2025). Mapping the semiconductor value chain: Working towards identifying dependencies and vulnerabilities. OECD Science, Technology and Industry Policy Papers 182. DOI: 10.1787/4154cdbf-en.</w:t>
       </w:r>
     </w:p>
     <w:p>
       <w:pPr>
-        <w:spacing w:line="276" w:lineRule="auto" w:after="120"/>
+        <w:spacing w:line="276" w:lineRule="auto" w:after="60"/>
         <w:ind w:hanging="397" w:left="397"/>
       </w:pPr>
       <w:r>
-        <w:t>21. OECD (2025). Mapping the semiconductor value chain: Working towards identifying dependencies and vulnerabilities. OECD Science, Technology and Industry Policy Papers 182. DOI: 10.1787/4154cdbf-en.</w:t>
+        <w:t>21. Shin S.-Y.; Shin S.-H. (2021). Analysis of Korean Import and Export in the Semiconductor Industry: A Global Supply Chain Perspective. Journal of Korea Trade 25(6), 78–104. DOI: 10.35611/jkt.2021.25.6.78.</w:t>
       </w:r>
     </w:p>
     <w:p>
       <w:pPr>
-        <w:spacing w:line="276" w:lineRule="auto" w:after="120"/>
+        <w:spacing w:line="276" w:lineRule="auto" w:after="60"/>
         <w:ind w:hanging="397" w:left="397"/>
       </w:pPr>
       <w:r>
-        <w:t>22. Shin S.-Y.; Shin S.-H. (2021). Analysis of Korean Import and Export in the Semiconductor Industry: A Global Supply Chain Perspective. Journal of Korea Trade 25(6), 78–104. DOI: 10.35611/jkt.2021.25.6.78.</w:t>
+        <w:t>22. Shorrocks A. F. (2013). Decomposition procedures for distributional analysis: a unified framework based on the Shapley value. Journal of Economic Inequality 11(1), 99–126. DOI: 10.1007/s10888-011-9214-z. Использованная версия: Shorrocks A. F. (1999). Decomposition Procedures for Distributional Analysis: A Unified Framework Based on the Shapley Value. First draft, June.</w:t>
       </w:r>
     </w:p>
     <w:p>
       <w:pPr>
-        <w:spacing w:line="276" w:lineRule="auto" w:after="120"/>
+        <w:spacing w:line="276" w:lineRule="auto" w:after="60"/>
         <w:ind w:hanging="397" w:left="397"/>
       </w:pPr>
       <w:r>
-        <w:t>23. Shorrocks A. F. (2013). Decomposition procedures for distributional analysis: a unified framework based on the Shapley value. Journal of Economic Inequality 11(1), 99–126. DOI: 10.1007/s10888-011-9214-z.</w:t>
+        <w:t>23. Vannoorenberghe G.; Wang Z.; Yu Z. (2016). Volatility and diversification of exports: Firm-level theory and evidence. European Economic Review 89, 216–247. DOI: 10.1016/j.euroecorev.2016.07.002. Использованная версия: Vannoorenberghe G.; Wang Z.; Yu Z. (2014). Volatility and Diversification of Exports: Firm-Level Theory and Evidence. CESifo Working Paper 4916, July.</w:t>
       </w:r>
     </w:p>
     <w:p>
       <w:pPr>
-        <w:spacing w:line="276" w:lineRule="auto" w:after="120"/>
+        <w:spacing w:line="276" w:lineRule="auto" w:after="60"/>
         <w:ind w:hanging="397" w:left="397"/>
       </w:pPr>
       <w:r>
-        <w:t>24. Vannoorenberghe G.; Wang Z.; Yu Z. (2016). Volatility and diversification of exports: Firm-level theory and evidence. European Economic Review 89, 216–247. DOI: 10.1016/j.euroecorev.2016.07.002.</w:t>
+        <w:t>24. World Customs Organization (2017). Harmonized System Nomenclature, Chapter 85, heading 85.42.</w:t>
       </w:r>
     </w:p>
     <w:p>
       <w:pPr>
-        <w:spacing w:line="276" w:lineRule="auto" w:after="120"/>
+        <w:spacing w:line="276" w:lineRule="auto" w:after="60"/>
         <w:ind w:hanging="397" w:left="397"/>
       </w:pPr>
       <w:r>
-        <w:t>25. World Customs Organization (2017). Harmonized System Nomenclature, Chapter 85, heading 85.42.</w:t>
+        <w:t>25. World Customs Organization (2022). Harmonized System Nomenclature, Chapter 85, heading 85.42.</w:t>
       </w:r>
     </w:p>
     <w:p>
       <w:pPr>
-        <w:spacing w:line="276" w:lineRule="auto" w:after="120"/>
+        <w:spacing w:line="276" w:lineRule="auto" w:after="60"/>
         <w:ind w:hanging="397" w:left="397"/>
       </w:pPr>
       <w:r>
-        <w:t>26. World Customs Organization (2022). Harmonized System Nomenclature, Chapter 85, heading 85.42.</w:t>
-      </w:r>
-    </w:p>
-    <w:p>
-      <w:pPr>
-        <w:spacing w:line="276" w:lineRule="auto" w:after="120"/>
-        <w:ind w:hanging="397" w:left="397"/>
-      </w:pPr>
-      <w:r>
-        <w:t>27. Yu A.; Yu S. (2026). U.S. Integrated Circuit Exports and Global Value Chain Positioning. Open Journal of Business and Management 14(1), 51–67. DOI: 10.4236/ojbm.2026.141004.</w:t>
+        <w:t>26. Yu A.; Yu S. (2026). U.S. Integrated Circuit Exports and Global Value Chain Positioning: Strategic Implications for International Business and Supply Chain Management. Open Journal of Business and Management 14(1), 51–67. DOI: 10.4236/ojbm.2026.141004.</w:t>
       </w:r>
     </w:p>
     <w:sectPr>
@@ -1310,7 +1506,7 @@
         <w:footnoteRef/>
       </w:r>
       <w:r>
-        <w:t xml:space="preserve"> OECD (2025). Mapping the semiconductor value chain: Working towards identifying dependencies and vulnerabilities. OECD Science, Technology and Industry Policy Papers 182. С. 9–15.</w:t>
+        <w:t xml:space="preserve"> OECD (2025). Mapping the semiconductor value chain: Working towards identifying dependencies and vulnerabilities. OECD Science, Technology and Industry Policy Papers 182. С. 9–10.</w:t>
       </w:r>
     </w:p>
   </w:footnote>
@@ -1438,7 +1634,7 @@
         <w:footnoteRef/>
       </w:r>
       <w:r>
-        <w:t xml:space="preserve"> Koh W. C. (2026). Tariffs, Tech Controls, and Techno-nationalism: Korea’s Semiconductor Industry in an Era of Sanctions and Strategic Competition. AMRO ACR-2026-03, Selected Issue 1. С. 1–6.</w:t>
+        <w:t xml:space="preserve"> Bank of Korea (2023). Characteristics of Demand Structure for Korea’s Semiconductors and Implications. Korea Economic Outlook, May, 53–62; English release 31 July. С. 54, 61–62.</w:t>
       </w:r>
     </w:p>
   </w:footnote>
@@ -1454,7 +1650,7 @@
         <w:footnoteRef/>
       </w:r>
       <w:r>
-        <w:t xml:space="preserve"> Li L.; Wang H.; Li Z.; Hu S. (2025). Analysis of the structure and robustness of the global semiconductor trade network. PLOS ONE 20(1), e0313162. Разделы о методах и устойчивости сети.</w:t>
+        <w:t xml:space="preserve"> Koh W. C. (2026). Tariffs, Tech Controls, and Techno-nationalism: Korea’s Semiconductor Industry in an Era of Sanctions and Strategic Competition. AMRO ACR-2026-03, Selected Issue 1. С. 1–6.</w:t>
       </w:r>
     </w:p>
   </w:footnote>
@@ -1470,7 +1666,7 @@
         <w:footnoteRef/>
       </w:r>
       <w:r>
-        <w:t xml:space="preserve"> Cadot O.; Carrère C.; Strauss-Kahn V. (2013). Trade Diversification, Income, and Growth: What Do We Know? Journal of Economic Surveys 27(4), 790–812. Раздел 2 рабочего доклада FERDI P33, 2011.</w:t>
+        <w:t xml:space="preserve"> Li L.; Wang H.; Li Z.; Hu S. (2025). Analysis of the structure and robustness of the global semiconductor trade network. PLOS ONE 20(1), e0313162. Разделы о методах и устойчивости сети.</w:t>
       </w:r>
     </w:p>
   </w:footnote>
@@ -1486,7 +1682,7 @@
         <w:footnoteRef/>
       </w:r>
       <w:r>
-        <w:t xml:space="preserve"> Markowitz H. (1952). Portfolio Selection. Journal of Finance 7(1), 77–91. С. 79–81.</w:t>
+        <w:t xml:space="preserve"> Cadot O.; Carrère C.; Strauss-Kahn V. (2011). Trade Diversification, Income, and Growth: What Do We Know? FERDI Working Paper P33, November. Раздел 2, с. 2–5.</w:t>
       </w:r>
     </w:p>
   </w:footnote>
@@ -1502,7 +1698,7 @@
         <w:footnoteRef/>
       </w:r>
       <w:r>
-        <w:t xml:space="preserve"> Koren M.; Tenreyro S. (2007). Volatility and Development. Quarterly Journal of Economics 122(1), 243–287. С. 243–247.</w:t>
+        <w:t xml:space="preserve"> Markowitz H. (1952). Portfolio Selection. Journal of Finance 7(1), 77–91. С. 79–81.</w:t>
       </w:r>
     </w:p>
   </w:footnote>
@@ -1518,7 +1714,7 @@
         <w:footnoteRef/>
       </w:r>
       <w:r>
-        <w:t xml:space="preserve"> Caselli F.; Koren M.; Lisicky M.; Tenreyro S. (2020). Diversification through Trade. Quarterly Journal of Economics 135(1), 449–502. Введение авторской версии, июнь 2019 года.</w:t>
+        <w:t xml:space="preserve"> Koren M.; Tenreyro S. (2007). Volatility and Development. Quarterly Journal of Economics 122(1), 243–287. С. 243–244.</w:t>
       </w:r>
     </w:p>
   </w:footnote>
@@ -1534,7 +1730,7 @@
         <w:footnoteRef/>
       </w:r>
       <w:r>
-        <w:t xml:space="preserve"> Vannoorenberghe G.; Wang Z.; Yu Z. (2016). Volatility and diversification of exports: Firm-level theory and evidence. European Economic Review 89, 216–247. Введение CESifo Working Paper 4916, 2014.</w:t>
+        <w:t xml:space="preserve"> Caselli F.; Koren M.; Lisicky M.; Tenreyro S. (2019). Diversification through Trade. Author manuscript, June. Авторская версия, июнь 2019 года, с. 2–3.</w:t>
       </w:r>
     </w:p>
   </w:footnote>
@@ -1550,7 +1746,7 @@
         <w:footnoteRef/>
       </w:r>
       <w:r>
-        <w:t xml:space="preserve"> Lee J.; Yu B.-K. (2019). The Effects of Export Diversification on Macroeconomic Stabilization: Evidence from Korea. KDI Journal of Economic Policy 41(1), 1–14. С. 5–11.</w:t>
+        <w:t xml:space="preserve"> Vannoorenberghe G.; Wang Z.; Yu Z. (2014). Volatility and Diversification of Exports: Firm-Level Theory and Evidence. CESifo Working Paper 4916, July. Аннотация и введение рабочей версии, с. 1–3.</w:t>
       </w:r>
     </w:p>
   </w:footnote>
@@ -1566,7 +1762,7 @@
         <w:footnoteRef/>
       </w:r>
       <w:r>
-        <w:t xml:space="preserve"> Esposito F. (2022). Demand risk and diversification through international trade. Journal of International Economics 135, 103562. Введение и модель в MPRA Paper 100398, 2020.</w:t>
+        <w:t xml:space="preserve"> Lee J.; Yu B.-K. (2019). The Effects of Export Diversification on Macroeconomic Stabilization: Evidence from Korea. KDI Journal of Economic Policy 41(1), 1–14. С. 5–11.</w:t>
       </w:r>
     </w:p>
   </w:footnote>
@@ -1582,7 +1778,7 @@
         <w:footnoteRef/>
       </w:r>
       <w:r>
-        <w:t xml:space="preserve"> Hong Q.; Jin Z.; Liu R.; Tong J. (2026). Demand Shocks, Export Diversification, and Firm Performance During the Great Trade Collapse. Journal of Economics &amp; Management Strategy, e70027, 1–18. Аннотация и введение опубликованной статьи.</w:t>
+        <w:t xml:space="preserve"> Hong Q.; Jin Z.; Liu R.; Tong J. (2026). Demand Shocks, Export Diversification, and Firm Performance During the Great Trade Collapse. Journal of Economics &amp; Management Strategy, e70027, 1–18. Разделы 2–4 и 7 опубликованной электронной версии.</w:t>
       </w:r>
     </w:p>
   </w:footnote>
@@ -1598,7 +1794,7 @@
         <w:footnoteRef/>
       </w:r>
       <w:r>
-        <w:t xml:space="preserve"> Barigozzi M.; Cuzzola A.; Grazzi M.; Moschella D. (2025; online 2024). Factoring in the Micro: A Transaction-Level Dynamic Factor Approach to the Decomposition of Export Volatility. Oxford Bulletin of Economics and Statistics 87(1), 155–184. Аннотация опубликованной статьи.</w:t>
+        <w:t xml:space="preserve"> Esposito F. (2020). Demand Risk and Diversification through Trade. MPRA Paper 100398, May. С. 1–3 рабочей версии.</w:t>
       </w:r>
     </w:p>
   </w:footnote>
@@ -1614,7 +1810,7 @@
         <w:footnoteRef/>
       </w:r>
       <w:r>
-        <w:t xml:space="preserve"> Shin S.-Y.; Shin S.-H. (2021). Analysis of Korean Import and Export in the Semiconductor Industry: A Global Supply Chain Perspective. Journal of Korea Trade 25(6), 78–104. С. 78–80, 97–99.</w:t>
+        <w:t xml:space="preserve"> Barigozzi M.; Cuzzola A.; Grazzi M.; Moschella D. (2025; online 2024). Factoring in the Micro: A Transaction-Level Dynamic Factor Approach to the Decomposition of Export Volatility. Oxford Bulletin of Economics and Statistics 87(1), 155–184. Разделы 2–5 опубликованной электронной версии.</w:t>
       </w:r>
     </w:p>
   </w:footnote>
@@ -1630,7 +1826,7 @@
         <w:footnoteRef/>
       </w:r>
       <w:r>
-        <w:t xml:space="preserve"> Koo J. H. (2026). Structural Changes in Korea’s Semiconductor Supply Chain under the Changing Economic Security Environment: An Analysis of Trade Structures, 2015–2025. Public Policy Review 40(2), 319–339. С. 324–336.</w:t>
+        <w:t xml:space="preserve"> Shin S.-Y.; Shin S.-H. (2021). Analysis of Korean Import and Export in the Semiconductor Industry: A Global Supply Chain Perspective. Journal of Korea Trade 25(6), 78–104. С. 78–79, 97–98.</w:t>
       </w:r>
     </w:p>
   </w:footnote>
@@ -1646,7 +1842,7 @@
         <w:footnoteRef/>
       </w:r>
       <w:r>
-        <w:t xml:space="preserve"> Kitetu G. M.; Mbante II A. R.; Ko J.-H. (2021). Revealed Trade Competitiveness between Korea and Japan. Is It Viable to Deepen Economic Integration? Journal of Global Business and Trade 17(2), 67–84. Раздел IV и заключение авторской копии.</w:t>
+        <w:t xml:space="preserve"> Koo J. H. (2026). Structural Changes in Korea’s Semiconductor Supply Chain under the Changing Economic Security Environment: An Analysis of Trade Structures, 2015–2025. Public Policy Review 40(2), 319–339. С. 324–325, 335–336.</w:t>
       </w:r>
     </w:p>
   </w:footnote>
@@ -1662,7 +1858,7 @@
         <w:footnoteRef/>
       </w:r>
       <w:r>
-        <w:t xml:space="preserve"> Yu A.; Yu S. (2026). U.S. Integrated Circuit Exports and Global Value Chain Positioning. Open Journal of Business and Management 14(1), 51–67. С. 51–67.</w:t>
+        <w:t xml:space="preserve"> Kitetu G. M.; Mbante II A. R.; Ko J.-H. (2021). Revealed Trade Competitiveness between Korea and Japan. Is It Viable to Deepen Economic Integration? Journal of Global Business and Trade 17(2), 67–84. Аннотация опубликованной статьи, с. 67; полный файл не получен.</w:t>
       </w:r>
     </w:p>
   </w:footnote>
@@ -1678,7 +1874,7 @@
         <w:footnoteRef/>
       </w:r>
       <w:r>
-        <w:t xml:space="preserve"> Kim T.-H.; Lee M.-J. (2025). Assessing Trade Concentration, Dependency, and Resilience in Korea’s Semiconductor Supply Chain: A Network and Entropy-Based Approach. Journal of Korea Trade 29(7), 67–95. По аннотации KCI; полный текст не получен.</w:t>
+        <w:t xml:space="preserve"> Yu A.; Yu S. (2026). U.S. Integrated Circuit Exports and Global Value Chain Positioning: Strategic Implications for International Business and Supply Chain Management. Open Journal of Business and Management 14(1), 51–67. Раздел 3, с. 54–57.</w:t>
       </w:r>
     </w:p>
   </w:footnote>
@@ -1694,7 +1890,7 @@
         <w:footnoteRef/>
       </w:r>
       <w:r>
-        <w:t xml:space="preserve"> Hong M.-S. (2023). Analysis of export changes to major trading partners of the Korean semiconductor industry. The e-Business Studies 24(6), 179–189. По аннотации KCI; полный текст не получен.</w:t>
+        <w:t xml:space="preserve"> Hong M.-S. (2023). Analysis of export changes to major trading partners of the Korean semiconductor industry. The e-Business Studies 24(6), 179–189. Аннотация в KCI; полный текст не получен.</w:t>
       </w:r>
     </w:p>
   </w:footnote>
@@ -1710,7 +1906,7 @@
         <w:footnoteRef/>
       </w:r>
       <w:r>
-        <w:t xml:space="preserve"> Kim J. S. (2021). Research on CMS decomposition of South Korea’s manufacturing exports to China. IOP Conference Series: Earth and Environmental Science 791, 012170. Постановка CMS в авторской копии.</w:t>
+        <w:t xml:space="preserve"> Kim T.-H.; Lee M.-J. (2025). Assessing Trade Concentration, Dependency, and Resilience in Korea’s Semiconductor Supply Chain: A Network and Entropy-Based Approach. Journal of Korea Trade 29(7), 67–95. Аннотация в KCI; полный текст не получен.</w:t>
       </w:r>
     </w:p>
   </w:footnote>
@@ -1726,7 +1922,7 @@
         <w:footnoteRef/>
       </w:r>
       <w:r>
-        <w:t xml:space="preserve"> Kim C.-Y.; Park K. S. (2018). A Study on Analysis of Export Concentration of Korea: Application of Herfindahl-Hirschman Index, Concentration Ratio, Sharpe Ratio and Value-at-Risk. Korea International Commercial Review 33(3), 273–289. По аннотации KCI; полный текст не получен.</w:t>
+        <w:t xml:space="preserve"> Kim C.-Y.; Park K. S. (2018). A Study on Analysis of Export Concentration of Korea: Application of Herfindahl-Hirschman Index, Concentration Ratio, Sharpe Ratio and Value-at-Risk. Korea International Commercial Review 33(3), 273–289. Аннотация в KCI; полный текст не получен.</w:t>
       </w:r>
     </w:p>
   </w:footnote>
@@ -1742,7 +1938,39 @@
         <w:footnoteRef/>
       </w:r>
       <w:r>
-        <w:t xml:space="preserve"> Shorrocks A. F. (2013). Decomposition procedures for distributional analysis: a unified framework based on the Shapley value. Journal of Economic Inequality 11(1), 99–126. Методологический раздел авторского проекта, июнь 1999 года.</w:t>
+        <w:t xml:space="preserve"> Jo K.; Jung K.-C. (2023). Semiconductor Market Trends and Macroeconomic Implications. KDI Economic Outlook, First Half, 10 May. С. 3.</w:t>
+      </w:r>
+    </w:p>
+  </w:footnote>
+  <w:footnote w:id="29">
+    <w:p>
+      <w:pPr>
+        <w:pStyle w:val="FootnoteText"/>
+      </w:pPr>
+      <w:r>
+        <w:rPr>
+          <w:rStyle w:val="FootnoteReference"/>
+        </w:rPr>
+        <w:footnoteRef/>
+      </w:r>
+      <w:r>
+        <w:t xml:space="preserve"> Bank of Korea (2023). Characteristics of Demand Structure for Korea’s Semiconductors and Implications. Korea Economic Outlook, May, 53–62; English release 31 July. С. 61–62.</w:t>
+      </w:r>
+    </w:p>
+  </w:footnote>
+  <w:footnote w:id="30">
+    <w:p>
+      <w:pPr>
+        <w:pStyle w:val="FootnoteText"/>
+      </w:pPr>
+      <w:r>
+        <w:rPr>
+          <w:rStyle w:val="FootnoteReference"/>
+        </w:rPr>
+        <w:footnoteRef/>
+      </w:r>
+      <w:r>
+        <w:t xml:space="preserve"> Shorrocks A. F. (1999). Decomposition Procedures for Distributional Analysis: A Unified Framework Based on the Shapley Value. First draft, June. Раздел 2, с. 4–6 авторской версии.</w:t>
       </w:r>
     </w:p>
   </w:footnote>

</xml_diff>

<commit_message>
Expand theoretical chapter and align three-chapter thesis structure
</commit_message>
<xml_diff>
--- a/research/02_chip_trade/documents/chapter1.docx
+++ b/research/02_chip_trade/documents/chapter1.docx
@@ -12,7 +12,7 @@
     </w:p>
     <w:p>
       <w:r>
-        <w:t>Диверсификация экспорта обычно связывается с уменьшением зависимости от отдельных товаров и покупателей. Однако более равномерное распределение поставок не определяет однозначно изменчивость их стоимости. Значение имеют волатильность каждого потока и степень согласованности колебаний между ними. Для интегральных схем эта проблема особенно существенна: товарные категории различаются по ценовой динамике, а несколько стран назначения могут обслуживать один рынок конечной продукции. В главе рассматриваются экономические механизмы этой связи и результаты существующих исследований. На их основе обосновывается оценка товарного и географического вкладов в изменение условной исторической волатильности экспорта интегральных схем Японии и Республики Корея.</w:t>
+        <w:t>Диверсификация экспорта обычно связывается с уменьшением зависимости от отдельных товаров и покупателей. Однако более равномерное распределение поставок не определяет однозначно изменчивость их стоимости. Значение имеют волатильность каждого потока и степень согласованности колебаний между ними. Для интегральных схем эта проблема особенно существенна: товарные категории различаются по ценовой динамике, а несколько стран назначения могут обслуживать один рынок конечной продукции. В главе рассматриваются особенности отрасли, механизмы связи диверсификации с волатильностью и результаты существующих исследований. Теоретический анализ формирует основание для сопоставления экспорта Японии и Республики Корея и последующей разработки рекомендаций с учетом выявленных структурных различий.</w:t>
       </w:r>
     </w:p>
     <w:p>
@@ -37,12 +37,7 @@
     </w:p>
     <w:p>
       <w:r>
-        <w:t>Существование различных организационных моделей усиливает значение такого разделения. Компании могут совмещать разработку и производство, специализироваться на проектировании либо изготавливать продукцию по заказам других участников. Пересечение границы не обязательно совпадает с передачей изделия конечному потребителю или со сменой его собственника. Таможенная стоимость поэтому характеризует валовой торговый поток, а не созданную внутри страны добавленную стоимость и не бухгалтерскую выручку конкретной компании. В дальнейшем выражение «экспортная выручка» используется как краткое обозначение номинальной стоимости зарегистрированных поставок.</w:t>
-      </w:r>
-    </w:p>
-    <w:p>
-      <w:r>
-        <w:t>Отраслевая специализация создает возможности для экономии на масштабе, но одновременно формирует взаимную зависимость участников. Haramboure и соавторы исследуют эти связи с использованием межстрановых таблиц затрат и выпуска, в которых полупроводниковое производство выделено из более широкой электронной промышленности. Они показывают, что значение отрасли определяется ее положением среди поставщиков промежуточных ресурсов для других производств. Ограничение выпуска или поставок чипов способно затронуть несколько отраслей покупателей. Такой подход раскрывает производственные связи, которые невозможно полностью описать двусторонними экспортными долями.</w:t>
+        <w:t>Промежуточное назначение чипов определяет характер спроса на них. Заказ производителю компонентов возникает в связи с планами выпуска конечного оборудования и потребностью сборочного предприятия в запасах. Поэтому изменение продаж электроники передается экспортерам через решения других участников цепочки. Между покупкой компонента, изготовлением устройства и его реализацией может проходить время, в течение которого рыночные ожидания меняются. Для объяснения экспортного цикла необходимо учитывать не только конечное потребление, но и то, каким образом производственные предприятия приспосабливают к нему свои заказы. В исследовании KDI эти связи рассматриваются через динамику спроса на устройства, производства и запасов.</w:t>
       </w:r>
       <w:r>
         <w:rPr>
@@ -54,13 +49,59 @@
     </w:p>
     <w:p>
       <w:r>
+        <w:t>Существование различных организационных моделей усиливает значение такого разделения. Компании могут совмещать разработку и производство, специализироваться на проектировании либо изготавливать продукцию по заказам других участников. Пересечение границы не обязательно совпадает с передачей изделия конечному потребителю или со сменой его собственника. Таможенная стоимость поэтому характеризует валовой торговый поток, а не созданную внутри страны добавленную стоимость и не бухгалтерскую выручку конкретной компании. В дальнейшем выражение «экспортная выручка» используется как краткое обозначение номинальной стоимости зарегистрированных поставок.</w:t>
+      </w:r>
+    </w:p>
+    <w:p>
+      <w:r>
+        <w:t>Специализация на отдельной стадии опирается на накопленные знания и совместимость используемых технологий. В докладе ОЭСР показано, что проектирование связано с программными средствами, готовыми блоками интеллектуальной собственности и правилами конкретного производственного процесса. Решение о смене производственного партнера поэтому может требовать согласования проекта и технологии. Из этого следует, что географическое перераспределение поставок не всегда сводится к выбору другого покупателя при неизменных затратах. Часть торговых связей закреплена технологическими условиями, а возможности их изменения зависят от положения предприятия в цепочке.</w:t>
+      </w:r>
+      <w:r>
+        <w:rPr>
+          <w:rStyle w:val="FootnoteReference"/>
+        </w:rPr>
+        <w:footnoteReference w:id="3"/>
+      </w:r>
+      <w:r/>
+    </w:p>
+    <w:p>
+      <w:r>
+        <w:t>Для странового анализа также важно различать территорию производства и принадлежность компании. Предприятие, расположенное за рубежом, участвует в торговой статистике территории, из которой отправляется продукция, тогда как результаты международной компании могут объединять операции в нескольких странах. Поэтому отраслевые данные о компаниях и таможенные показатели характеризуют разные совокупности. В настоящей работе национальная принадлежность экспортного потока определяется страной регистрации вывоза. Такое определение позволяет последовательно изучать международные поставки, однако само по себе не устанавливает распределение прибыли и технологических компетенций между владельцами предприятий.</w:t>
+      </w:r>
+    </w:p>
+    <w:p>
+      <w:r>
+        <w:t>Отраслевая специализация создает возможности для экономии на масштабе, но одновременно формирует взаимную зависимость участников. Haramboure и соавторы исследуют эти связи с использованием межстрановых таблиц «затраты — выпуск», в которых полупроводниковое производство выделено из более широкой электронной промышленности. Они показывают, что значение отрасли определяется ее положением среди поставщиков промежуточных ресурсов для других производств. Ограничение выпуска или поставок чипов способно затронуть несколько отраслей покупателей. Такой подход раскрывает производственные связи, которые невозможно полностью описать двусторонними экспортными долями.</w:t>
+      </w:r>
+      <w:r>
+        <w:rPr>
+          <w:rStyle w:val="FootnoteReference"/>
+        </w:rPr>
+        <w:footnoteReference w:id="4"/>
+      </w:r>
+      <w:r/>
+    </w:p>
+    <w:p>
+      <w:r>
+        <w:t>Высокие постоянные затраты усиливают значение масштаба производства. Расходы на создание мощностей и освоение технологии должны возмещаться за счет продаж на достаточно широком рынке. У Haramboure и соавторов высокие фиксированные издержки и концентрация рассматриваются среди структурных особенностей полупроводниковой цепочки. Экономическая привлекательность специализации при этом сосуществует с уязвимостью к изменению спроса на ограниченный набор изделий. Для экспортера значение имеет не только способность наращивать продажи в благоприятный период, но и характер загрузки уже созданных мощностей при ухудшении конъюнктуры.</w:t>
+      </w:r>
+      <w:r>
+        <w:rPr>
+          <w:rStyle w:val="FootnoteReference"/>
+        </w:rPr>
+        <w:footnoteReference w:id="5"/>
+      </w:r>
+      <w:r/>
+    </w:p>
+    <w:p>
+      <w:r>
         <w:t>Для анализа торговой статистики необходимо установить товарные границы исследования. В Гармонизированной системе описания и кодирования товаров (HS) интегральные схемы относятся к позиции 8542. На шестизначном уровне выделяются процессоры и контроллеры — 854231, запоминающие устройства — 854232, усилители — 854233, прочие интегральные схемы — 854239, а также части — 854290. Эти коды и их основные наименования сохраняются в редакциях HS 2017 и HS 2022. Основную совокупность исследования составляют первые четыре категории; части включаются в отдельную проверку чувствительности. Такое определение обеспечивает одинаковые товарные границы сравнения стран.</w:t>
       </w:r>
       <w:r>
         <w:rPr>
           <w:rStyle w:val="FootnoteReference"/>
         </w:rPr>
-        <w:footnoteReference w:id="3"/>
+        <w:footnoteReference w:id="6"/>
       </w:r>
       <w:r>
         <w:rPr>
@@ -76,13 +117,18 @@
         <w:rPr>
           <w:rStyle w:val="FootnoteReference"/>
         </w:rPr>
-        <w:footnoteReference w:id="4"/>
+        <w:footnoteReference w:id="7"/>
       </w:r>
       <w:r/>
     </w:p>
     <w:p>
       <w:r>
-        <w:t>Позиция 8542 охватывает лишь часть полупроводниковой отрасли. В нее не входят все материалы, производственное оборудование и дискретные приборы. Кроме того, шестизначная классификация не позволяет непосредственно установить технологический уровень каждой схемы или ее конечное применение. Например, категория процессоров и контроллеров не ограничивается передовыми вычислительными ускорителями, а категория памяти объединяет различные виды запоминающих устройств. Поэтому изменение доли товарного кода характеризует состав зарегистрированного экспорта. Для вывода о технологическом усложнении продукции необходима более подробная информация.</w:t>
+        <w:t>Позиция 8542 охватывает лишь часть полупроводниковой отрасли. Она не охватывает всю совокупность материалов, производственного оборудования и дискретных полупроводниковых приборов. Кроме того, шестизначная классификация не позволяет непосредственно установить технологический уровень каждой схемы или ее конечное применение. Например, категория процессоров и контроллеров не ограничивается передовыми вычислительными ускорителями, а категория памяти объединяет различные виды запоминающих устройств. Поэтому изменение доли товарного кода характеризует состав зарегистрированного экспорта. Для вывода о технологическом усложнении продукции необходима более подробная информация.</w:t>
+      </w:r>
+    </w:p>
+    <w:p>
+      <w:r>
+        <w:t>Сопоставимость классификации необходима и для правильного определения самой диверсификации. Изменение ассортимента внутри одного шестизначного кода может быть технологически существенным, но не отразиться в числе наблюдаемых категорий. Напротив, рост стоимости небольшой категории изменит измеряемые доли даже без появления нового изделия. Поэтому товарная диверсификация на уровне HS характеризует распределение экспортной стоимости между статистическими группами. Ее связь с инновациями, сложностью производства и качеством продукции должна устанавливаться отдельно. Для поставленного вопроса важна прежде всего возможность последовательно сравнивать одни и те же группы во времени.</w:t>
       </w:r>
     </w:p>
     <w:p>
@@ -93,7 +139,19 @@
         <w:rPr>
           <w:rStyle w:val="FootnoteReference"/>
         </w:rPr>
-        <w:footnoteReference w:id="5"/>
+        <w:footnoteReference w:id="8"/>
+      </w:r>
+      <w:r/>
+    </w:p>
+    <w:p>
+      <w:r>
+        <w:t>Рыночная конъюнктура и инвестиционные решения могут меняться с разной скоростью. Jo и Jung отмечают, что инвестиции в оборудование опираются на среднесрочные и долгосрочные планы, учитывающие развитие технологий и ожидаемый спрос. Поэтому текущий спад продаж не обязательно сопровождается столь же выраженным сокращением инвестиций. При ослаблении спроса экспортная стоимость может измениться раньше, чем производственные мощности будут перестроены. Вследствие этого товарная специализация определяет характер краткосрочной реакции даже при сохранении прежних торговых партнеров. Такой механизм дает основание выделять память в анализе, сохраняя при этом различия и между остальными категориями интегральных схем.</w:t>
+      </w:r>
+      <w:r>
+        <w:rPr>
+          <w:rStyle w:val="FootnoteReference"/>
+        </w:rPr>
+        <w:footnoteReference w:id="9"/>
       </w:r>
       <w:r/>
     </w:p>
@@ -105,9 +163,14 @@
         <w:rPr>
           <w:rStyle w:val="FootnoteReference"/>
         </w:rPr>
-        <w:footnoteReference w:id="6"/>
+        <w:footnoteReference w:id="10"/>
       </w:r>
       <w:r/>
+    </w:p>
+    <w:p>
+      <w:r>
+        <w:t>Неодинаковое применение компонентов создает возможность несовпадения циклов спроса. Изменение потребности в одном виде конечного оборудования не обязано в той же степени затрагивать другие области использования чипов. Вместе с тем разные изделия могут зависеть от общих инвестиционных решений покупателей или от одного этапа обновления техники. В результате увеличение числа товарных категорий не гарантирует пропорционального увеличения числа независимых источников выручки. Для анализа полезно сохранять различие между наблюдаемым разнообразием продукции и экономическими причинами, которые одновременно меняют спрос на несколько ее видов.</w:t>
+      </w:r>
     </w:p>
     <w:p>
       <w:r>
@@ -117,9 +180,26 @@
         <w:rPr>
           <w:rStyle w:val="FootnoteReference"/>
         </w:rPr>
-        <w:footnoteReference w:id="7"/>
+        <w:footnoteReference w:id="11"/>
       </w:r>
       <w:r/>
+    </w:p>
+    <w:p>
+      <w:r>
+        <w:t>Дополнительным звеном выступает изменение запасов. Производитель конечного оборудования может временно уменьшить закупки компонентов, используя ранее накопленные резервы, даже если продажи его продукции сокращаются слабее. После исчерпания запасов потребность в новых заказах, напротив, способна увеличиться без такого же ускорения конечного спроса. Jo и Jung рассматривают согласование производственного цикла с накоплением и сокращением запасов, отмечая временной разрыв между их поворотными точками. Для экспортной статистики это означает, что месячные колебания отгрузок могут отражать также решения о сроках закупок.</w:t>
+      </w:r>
+      <w:r>
+        <w:rPr>
+          <w:rStyle w:val="FootnoteReference"/>
+        </w:rPr>
+        <w:footnoteReference w:id="12"/>
+      </w:r>
+      <w:r/>
+    </w:p>
+    <w:p>
+      <w:r>
+        <w:t>Стоимостная структура чувствительна к относительным ценам. Если стоимость одной категории падает при неизменной стоимости остальных, ее доля сокращается, а относительный вес остальных категорий увеличивается. Такое перераспределение не обязательно свидетельствует о целенаправленном выходе в новые сегменты. Аналогично увеличение доли отдельного направления может происходить потому, что другие рынки переживают более глубокий спад. Поэтому описание структурных сдвигов должно связывать относительные доли с абсолютной стоимостью потоков. Это особенно существенно при сравнении начала и конца периода, которые могут соответствовать различным фазам отраслевого цикла.</w:t>
+      </w:r>
     </w:p>
     <w:p>
       <w:r>
@@ -129,7 +209,19 @@
         <w:rPr>
           <w:rStyle w:val="FootnoteReference"/>
         </w:rPr>
-        <w:footnoteReference w:id="8"/>
+        <w:footnoteReference w:id="13"/>
+      </w:r>
+      <w:r/>
+    </w:p>
+    <w:p>
+      <w:r>
+        <w:t>Производственная география и география конечного потребления образуют два разных уровня зависимости. Несколько стран сборки могут закупать компоненты для выпуска сходных устройств, продаваемых на одном крупном рынке. В таком случае расширение числа непосредственных направлений экспорта сохраняет общий источник изменения спроса. Возможен и обратный случай: один сборочный центр обслуживает покупателей в разных странах. Банк Кореи использует разграничение прямого экспорта и конечного спроса именно для уточнения характера внешней зависимости. В торговом анализе это требует осторожно связывать страну назначения с самостоятельным рынком потребления.</w:t>
+      </w:r>
+      <w:r>
+        <w:rPr>
+          <w:rStyle w:val="FootnoteReference"/>
+        </w:rPr>
+        <w:footnoteReference w:id="14"/>
       </w:r>
       <w:r/>
     </w:p>
@@ -141,7 +233,7 @@
         <w:rPr>
           <w:rStyle w:val="FootnoteReference"/>
         </w:rPr>
-        <w:footnoteReference w:id="9"/>
+        <w:footnoteReference w:id="15"/>
       </w:r>
       <w:r/>
     </w:p>
@@ -153,7 +245,19 @@
         <w:rPr>
           <w:rStyle w:val="FootnoteReference"/>
         </w:rPr>
-        <w:footnoteReference w:id="10"/>
+        <w:footnoteReference w:id="16"/>
+      </w:r>
+      <w:r/>
+    </w:p>
+    <w:p>
+      <w:r>
+        <w:t>Передача внешних ограничений также зависит от организации производства. Изменение условий доступа к оборудованию или технологии затрагивает возможности выпуска, тогда как ограничения на продажу определенному покупателю действуют через сбыт. Эти каналы могут пересекаться, если одна группа компаний одновременно участвует в нескольких стадиях цепочки. Koh рассматривает стратегические затруднения корейской отрасли в связи с международным размещением ее деятельности. Для настоящей работы этот контекст объясняет интерес к структуре экспортных связей, но не задает заранее направление наблюдаемого изменения волатильности.</w:t>
+      </w:r>
+      <w:r>
+        <w:rPr>
+          <w:rStyle w:val="FootnoteReference"/>
+        </w:rPr>
+        <w:footnoteReference w:id="17"/>
       </w:r>
       <w:r/>
     </w:p>
@@ -165,7 +269,7 @@
         <w:rPr>
           <w:rStyle w:val="FootnoteReference"/>
         </w:rPr>
-        <w:footnoteReference w:id="11"/>
+        <w:footnoteReference w:id="18"/>
       </w:r>
       <w:r/>
     </w:p>
@@ -195,9 +299,14 @@
         <w:rPr>
           <w:rStyle w:val="FootnoteReference"/>
         </w:rPr>
-        <w:footnoteReference w:id="12"/>
+        <w:footnoteReference w:id="19"/>
       </w:r>
       <w:r/>
+    </w:p>
+    <w:p>
+      <w:r>
+        <w:t>Расширение набора товаров и изменение долей уже существующих категорий могут происходить одновременно. Однако их экономическое содержание различается. В первом случае требуется освоение нового направления деятельности или начало поставок на ранее не обслуживаемый рынок. Во втором случае меняется относительный масштаб знакомых операций. Для отрасли с высокими затратами освоения производства это различие существенно: одинаковое снижение концентрации может сопровождаться разной потребностью в инвестициях, знаниях и времени. Поэтому числовой показатель диверсификации необходимо дополнять описанием того, за счет каких потоков он изменился.</w:t>
+      </w:r>
     </w:p>
     <w:p>
       <w:pPr>
@@ -349,19 +458,34 @@
     </w:p>
     <w:p>
       <w:r>
+        <w:t>Для содержательного сопоставления полезно различать количество направлений и их экономический вес. Если почти весь экспорт приходится на один рынок, наличие нескольких малых партнеров мало меняет структуру зависимости. При равных долях, напротив, ни одно направление не определяет совокупную стоимость в той же степени. Обратная величина HHI может интерпретироваться как число равновеликих направлений, дающих такую же концентрацию: при четырех одинаковых долях HHI равен 0,25, а его обратная величина равна четырем. Это преобразование облегчает интерпретацию неравномерности, но не добавляет сведений о совместных колебаниях потоков.</w:t>
+      </w:r>
+    </w:p>
+    <w:p>
+      <w:r>
+        <w:t>Сравнение концентрации требует сохранения единицы анализа. Индекс по странам назначения характеризует географию продаж, индекс по товарным кодам — состав экспортируемой продукции. Индекс по всем сочетаниям товара и направления учитывает их совместное распределение. Изменение одного показателя не предопределяет изменение остальных. Например, увеличение доли товара, продаваемого на большом числе рынков, способно снизить географическую концентрацию и одновременно усилить товарную. Это не противоречие между показателями, а отражение разных сторон экспортной структуры.</w:t>
+      </w:r>
+    </w:p>
+    <w:p>
+      <w:r>
         <w:t>Индекс описывает распределение весов, но не содержит сведений о колебаниях отдельных потоков. Две экспортные структуры с одинаковыми долями могут различаться по составу товаров, изменчивости цен и синхронности спроса. Экономическое обоснование диверсификации как способа уменьшения колебаний связано с портфельным подходом. В классической работе Markowitz риск совокупного портфеля определяется не только рисками отдельных составляющих, но и ковариациями между ними. Применительно к экспорту этот принцип позволяет перейти от количества рынков к анализу совместной динамики поставок.</w:t>
       </w:r>
       <w:r>
         <w:rPr>
           <w:rStyle w:val="FootnoteReference"/>
         </w:rPr>
-        <w:footnoteReference w:id="13"/>
+        <w:footnoteReference w:id="20"/>
       </w:r>
       <w:r/>
     </w:p>
     <w:p>
       <w:r>
         <w:t>Под волатильностью далее понимается стандартное отклонение темпов изменения экспортной стоимости за выбранный период. Соответствующая дисперсия измеряет разброс темпов относительно их среднего, учитывая и рост, и падение. Поэтому она не является мерой только неблагоприятных исходов и не характеризует вероятность прекращения поставок. Такое определение соответствует задаче оценки амплитуды исторических колебаний.</w:t>
+      </w:r>
+    </w:p>
+    <w:p>
+      <w:r>
+        <w:t>Выбор темпов изменения позволяет отделить относительную изменчивость от размера экспортера. При сопоставлении дисперсий стоимостных уровней более крупный поток может выглядеть более нестабильным только из-за масштаба. Использование относительных изменений делает единицу сравнения общей, однако сохраняет зависимость результата от способа расчета темпа и от временного интервала. Редкие крупные отгрузки, сезонность и длительные отраслевые подъемы воздействуют на показатели по-разному. Поэтому волатильность всегда должна сопровождаться указанием того, какая динамика и на каком горизонте измеряется.</w:t>
       </w:r>
     </w:p>
     <w:p>
@@ -687,7 +811,17 @@
     </w:p>
     <w:p>
       <w:r>
+        <w:t>Действие ковариации можно показать на условном примере двух потоков с одинаковыми весами и стандартным отклонением темпов по 10 процентных пунктов. При нулевой ковариации дисперсия их взвешенной суммы составляет 50 квадратов процентных пунктов, а стандартное отклонение — около 7,1 пункта. Если же их отклонения от средних полностью совпадают, стандартное отклонение суммы остается равным 10 пунктам. Доли и HHI в обоих случаях одинаковы. Различие результата целиком определяется тем, насколько изменения двух потоков компенсируют или воспроизводят друг друга.</w:t>
+      </w:r>
+    </w:p>
+    <w:p>
+      <w:r>
         <w:t>Связь концентрации с дисперсией особенно наглядна при одинаковой дисперсии всех потоков и нулевых ковариациях. Тогда дисперсия взвешенной суммы равна общей дисперсии одного потока, умноженной на HHI тех же ячеек. Это частный случай, в котором уменьшение концентрации однозначно снижает волатильность. В общем случае перенос веса на менее крупный, но более волатильный поток либо на направление с высокой ковариацией с остальными поставками способен дать противоположный результат. Поэтому даже снижение HHI на неизменной сетке еще не определяет знак изменения дисперсии.</w:t>
+      </w:r>
+    </w:p>
+    <w:p>
+      <w:r>
+        <w:t>При перераспределении весов необходимо учитывать обе стороны изменения: доля одного потока уменьшается, а другого увеличивается. Значение имеет не только собственная волатильность нового направления, но и его связь со всеми сохраняющимися поставками. Направление с умеренными отдельными колебаниями может усиливать общий спад, если его динамика совпадает с динамикой крупнейшей части экспорта. Направление с более выраженными колебаниями, напротив, иногда сглаживает общий показатель благодаря их несовпадению. Следовательно, оценка географических приоритетов зависит от исходного состава экспортного портфеля.</w:t>
       </w:r>
     </w:p>
     <w:p>
@@ -698,9 +832,14 @@
         <w:rPr>
           <w:rStyle w:val="FootnoteReference"/>
         </w:rPr>
-        <w:footnoteReference w:id="14"/>
+        <w:footnoteReference w:id="21"/>
       </w:r>
       <w:r/>
+    </w:p>
+    <w:p>
+      <w:r>
+        <w:t>Следует также различать концентрацию внутри одной отрасли и специализацию экономики в целом. Перераспределение между видами интегральных схем может изменить отраслевую волатильность, не создавая сопоставимой диверсификации всего национального экспорта. И наоборот, развитие других отраслей может сглаживать совокупные поступления при сохранении прежнего состава поставок чипов. Теоретический механизм суммирования рисков применим на обоих уровнях, но единицы наблюдения и экономические выводы различаются. В настоящей работе исследуется структура конкретной товарной группы, поэтому ее результаты прежде всего относятся к этой группе.</w:t>
+      </w:r>
     </w:p>
     <w:p>
       <w:r>
@@ -710,7 +849,7 @@
         <w:rPr>
           <w:rStyle w:val="FootnoteReference"/>
         </w:rPr>
-        <w:footnoteReference w:id="15"/>
+        <w:footnoteReference w:id="22"/>
       </w:r>
       <w:r/>
     </w:p>
@@ -722,9 +861,14 @@
         <w:rPr>
           <w:rStyle w:val="FootnoteReference"/>
         </w:rPr>
-        <w:footnoteReference w:id="16"/>
+        <w:footnoteReference w:id="23"/>
       </w:r>
       <w:r/>
+    </w:p>
+    <w:p>
+      <w:r>
+        <w:t>Постоянство торговых связей особенно важно для интерпретации небольших направлений. Появление поставок в отдельном месяце не обязательно означает формирование устойчивого канала сбыта. При расширении географии часть новых потоков может иметь малый объем и нерегулярный характер. С другой стороны, несколько крупных фирм способны поддерживать устойчивые связи даже при высокой отраслевой концентрации. Поэтому результаты фирменных исследований следует переносить на уровень страны с учетом агрегирования: изменения отдельных предприятий могут взаимно сглаживаться либо совпадать под действием общих условий.</w:t>
+      </w:r>
     </w:p>
     <w:p>
       <w:r>
@@ -735,6 +879,18 @@
       <w:r>
         <w:t>Стабильность представляет только одну из характеристик экспортной структуры. Сокращение дисперсии не обязательно сопровождается ростом средней выручки, прибыльности или производительности. Освоение менее волатильного сегмента требует ресурсов, а специализация может приносить выгоды от масштаба и накопленных компетенций. Портфельная оценка экспортных долей поэтому используется для измерения исторической изменчивости, без отождествления минимальной дисперсии с оптимальной промышленной политикой.</w:t>
       </w:r>
+    </w:p>
+    <w:p>
+      <w:r>
+        <w:t>Издержки изменения структуры ограничивают непосредственное применение финансовой аналогии. Долю финансового актива можно изменить операцией на рынке, тогда как перестройка экспортного состава может требовать освоения продукции, изменения мощностей и заключения договоров. В модели Esposito возможность снизить риск сопоставляется с торговыми издержками и расходами выхода на рынок. Следовательно, исторически менее волатильное распределение продаж не становится автоматически наиболее выгодным и осуществимым. Для рекомендаций необходимо учитывать как свойства динамики, так и экономические условия изменения самих весов.</w:t>
+      </w:r>
+      <w:r>
+        <w:rPr>
+          <w:rStyle w:val="FootnoteReference"/>
+        </w:rPr>
+        <w:footnoteReference w:id="24"/>
+      </w:r>
+      <w:r/>
     </w:p>
     <w:p>
       <w:pPr>
@@ -967,6 +1123,11 @@
     </w:p>
     <w:p>
       <w:r>
+        <w:t>Различие между совокупной географией и распределением внутри товара можно пояснить условным примером. Пусть доля одного рынка в поставках памяти выше, чем в поставках остальных схем. Если значение памяти в экспорте сокращается, совокупная доля этого рынка также может уменьшиться, хотя внутри каждой категории направления остались прежними. Такое изменение связано с товарным составом. Если же доля рынка меняется в поставках самой памяти, возникает самостоятельный географический сдвиг. Разделение этих случаев позволяет точнее описать, за счет какого измерения перестроился экспорт.</w:t>
+      </w:r>
+    </w:p>
+    <w:p>
+      <w:r>
         <w:t>Теоретический анализ связывает диверсификацию с волатильностью через изменение весов потоков, различия их собственных дисперсий и ковариации. Общий отраслевой цикл способен ограничивать выгоды от расширения географии, тогда как товарный сдвиг меняет экспозицию к этому циклу. Раздельное измерение двух структурных изменений позволяет установить, усиливают ли они друг друга или частично компенсируются.</w:t>
       </w:r>
     </w:p>
@@ -985,15 +1146,25 @@
     </w:p>
     <w:p>
       <w:r>
+        <w:t>Важную роль играет и уровень наблюдения. Данные фирмы позволяют связать экспорт с ее размером, производительностью и решениями о выходе на рынки. Межотраслевые данные характеризуют специализацию экономики, а статистика отдельных товаров — изменения внутри выбранной отрасли. Более подробная классификация расширяет возможности описания, но сама по себе не обеспечивает причинного объяснения. При сопоставлении литературы поэтому необходимо учитывать одновременно объект, частоту наблюдений, измеряемую величину и предпосылки метода. Именно такое сопоставление позволяет определить, какие результаты применимы к исследованию интегральных схем.</w:t>
+      </w:r>
+    </w:p>
+    <w:p>
+      <w:r>
         <w:t>На отраслевом уровне Lee и Yu изучают годовые данные по 24 отраслям обрабатывающей промышленности Кореи за 2000–2016 годы. В модели с фиксированными эффектами более высокая страновая диверсификация связана с меньшим сокращением экспорта во время кризиса 2009 года. Для товарной диверсификации и выявленных сравнительных преимуществ аналогичный результат в их спецификации не получен. Различие между двумя видами диверсификации тем самым имеет эмпирическое основание. Однако глубина падения в одном кризисе не равнозначна волатильности на всем интервале, а категории внутри интегральных схем существенно уже отраслей обрабатывающей промышленности.</w:t>
       </w:r>
       <w:r>
         <w:rPr>
           <w:rStyle w:val="FootnoteReference"/>
         </w:rPr>
-        <w:footnoteReference w:id="17"/>
+        <w:footnoteReference w:id="25"/>
       </w:r>
       <w:r/>
+    </w:p>
+    <w:p>
+      <w:r>
+        <w:t>Результат Lee и Yu относится к реакции экспортных отраслей на конкретный кризис. Показатель, связанный с меньшим падением в этом эпизоде, может быть полезен для объяснения уязвимости к сходному внешнему спаду, но его содержание отличается от среднего разброса темпов на протяжении нескольких фаз цикла. Для настоящего исследования это различие определяет способ постановки вопроса: необходимо оценивать всю выбранную историю колебаний, одновременно проверяя, насколько вывод зависит от отдельных ее участков. Такое расширение горизонта дополняет кризисный анализ, сохраняя различие между измеряемыми результатами.</w:t>
+      </w:r>
     </w:p>
     <w:p>
       <w:r>
@@ -1003,7 +1174,7 @@
         <w:rPr>
           <w:rStyle w:val="FootnoteReference"/>
         </w:rPr>
-        <w:footnoteReference w:id="18"/>
+        <w:footnoteReference w:id="26"/>
       </w:r>
       <w:r/>
     </w:p>
@@ -1015,9 +1186,14 @@
         <w:rPr>
           <w:rStyle w:val="FootnoteReference"/>
         </w:rPr>
-        <w:footnoteReference w:id="19"/>
+        <w:footnoteReference w:id="27"/>
       </w:r>
       <w:r/>
+    </w:p>
+    <w:p>
+      <w:r>
+        <w:t>Эндогенность экспортной структуры создает отдельную задачу интерпретации. Более устойчивые предприятия могут легче осваивать новые направления, а ожидание неблагоприятной конъюнктуры — побуждать к изменению товарных долей. Наблюдаемое сочетание структуры и динамики в таком случае отражает и влияние внешних условий, и реакцию участников. Историческое сравнение нескольких наборов весов позволяет отделить арифметическое значение структуры при заданных колебаниях. Для объяснения того, почему была выбрана именно эта структура и как участники изменили бы поведение при другой политике, необходима дополнительная модель их решений.</w:t>
+      </w:r>
     </w:p>
     <w:p>
       <w:r>
@@ -1027,9 +1203,14 @@
         <w:rPr>
           <w:rStyle w:val="FootnoteReference"/>
         </w:rPr>
-        <w:footnoteReference w:id="20"/>
+        <w:footnoteReference w:id="28"/>
       </w:r>
       <w:r/>
+    </w:p>
+    <w:p>
+      <w:r>
+        <w:t>Факторное разложение и структурное перевзвешивание различаются прежде всего тем, что считается изменяемой величиной. В первом случае исследователь стремится выделить общие и специфические составляющие динамики наблюдаемых потоков. Во втором случае сама история этих потоков сохраняется, а сравниваются способы их агрегирования. Выделение общего фактора помогает объяснить происхождение согласованных колебаний; изменение весов показывает, какую роль эти колебания играют при другой структуре. Поэтому близость исходного понятия волатильности не означает совпадения исследовательских задач, а результаты двух подходов могут содержательно дополнять друг друга.</w:t>
+      </w:r>
     </w:p>
     <w:p>
       <w:r>
@@ -1044,7 +1225,7 @@
         <w:rPr>
           <w:rStyle w:val="FootnoteReference"/>
         </w:rPr>
-        <w:footnoteReference w:id="21"/>
+        <w:footnoteReference w:id="29"/>
       </w:r>
       <w:r>
         <w:rPr>
@@ -1060,9 +1241,14 @@
         <w:rPr>
           <w:rStyle w:val="FootnoteReference"/>
         </w:rPr>
-        <w:footnoteReference w:id="22"/>
+        <w:footnoteReference w:id="30"/>
       </w:r>
       <w:r/>
+    </w:p>
+    <w:p>
+      <w:r>
+        <w:t>Сопоставление отраслевых работ требует одинаково трактовать границы продукции. Память и другие готовые схемы, производственное оборудование, материалы и части занимают разные места в цепочке. Совместный показатель по широкому набору может отражать одновременно изменения спроса на чипы и инвестиции в создание новых мощностей. Более узкая совокупность позволяет конкретизировать вопрос, но не описывает все формы специализации страны. Поэтому различие результатов исследований следует сначала проверить на уровне состава товаров и только затем связывать с выбором метода или экономическими особенностями рассматриваемого периода.</w:t>
+      </w:r>
     </w:p>
     <w:p>
       <w:r>
@@ -1072,7 +1258,7 @@
         <w:rPr>
           <w:rStyle w:val="FootnoteReference"/>
         </w:rPr>
-        <w:footnoteReference w:id="23"/>
+        <w:footnoteReference w:id="31"/>
       </w:r>
       <w:r>
         <w:rPr>
@@ -1088,7 +1274,7 @@
         <w:rPr>
           <w:rStyle w:val="FootnoteReference"/>
         </w:rPr>
-        <w:footnoteReference w:id="24"/>
+        <w:footnoteReference w:id="32"/>
       </w:r>
       <w:r>
         <w:rPr>
@@ -1104,7 +1290,7 @@
         <w:rPr>
           <w:rStyle w:val="FootnoteReference"/>
         </w:rPr>
-        <w:footnoteReference w:id="25"/>
+        <w:footnoteReference w:id="33"/>
       </w:r>
       <w:r/>
     </w:p>
@@ -1116,7 +1302,7 @@
         <w:rPr>
           <w:rStyle w:val="FootnoteReference"/>
         </w:rPr>
-        <w:footnoteReference w:id="26"/>
+        <w:footnoteReference w:id="34"/>
       </w:r>
       <w:r>
         <w:rPr>
@@ -1132,7 +1318,7 @@
         <w:rPr>
           <w:rStyle w:val="FootnoteReference"/>
         </w:rPr>
-        <w:footnoteReference w:id="27"/>
+        <w:footnoteReference w:id="35"/>
       </w:r>
       <w:r/>
     </w:p>
@@ -1144,9 +1330,14 @@
         <w:rPr>
           <w:rStyle w:val="FootnoteReference"/>
         </w:rPr>
-        <w:footnoteReference w:id="28"/>
+        <w:footnoteReference w:id="36"/>
       </w:r>
       <w:r/>
+    </w:p>
+    <w:p>
+      <w:r>
+        <w:t>Сценарий KDI важен и как пример границ интерпретации. Сохранение темпов сегментов позволяет выделить значение их долей для наблюдаемого сокращения экспорта. Однако оно не означает, что страна могла бы без издержек и без изменения рыночных условий перейти к среднемировому составу. Для расчета дисперсии аналогичное условие относится к совместной истории потоков: заменяются веса, а наблюдавшиеся колебания используются как общая основа сравнения. Поэтому содержательный вклад такого анализа состоит в оценке структурной подверженности уже наблюдавшимся изменениям, а не в прогнозе результата конкретной промышленной программы.</w:t>
+      </w:r>
     </w:p>
     <w:p>
       <w:r>
@@ -1156,7 +1347,7 @@
         <w:rPr>
           <w:rStyle w:val="FootnoteReference"/>
         </w:rPr>
-        <w:footnoteReference w:id="29"/>
+        <w:footnoteReference w:id="37"/>
       </w:r>
       <w:r/>
     </w:p>
@@ -1167,44 +1358,34 @@
     </w:p>
     <w:p>
       <w:r>
-        <w:t>Объектом исследования выступает экспорт интегральных схем Японии и Республики Корея, предметом — связь его товарной и географической структуры с исторической волатильностью номинальной стоимости в долларах США. Сопоставляются структуры 2017 и 2024 годов на месячных данных за 2017–2024 годы. Для сравнения с соответствующим месяцем предыдущего года используются наблюдения 2018–2024 годов. Выбор относительных изменений устраняет прямую зависимость показателя от масштаба экспортера, хотя не исключает влияния цен и валютной переоценки.</w:t>
-      </w:r>
-    </w:p>
-    <w:p>
-      <w:r>
-        <w:t>В основном расчете применяется симметричный темп изменения: разность текущей стоимости и стоимости годом ранее делится на их среднее. При неотрицательных стоимостях и положительном знаменателе он ограничен интервалом от −2 до 2 и позволяет учесть появление или прекращение поставок без неограниченного роста показателя из-за малой базы. Он отличается от обычного процентного темпа, поэтому определение роста остается частью интерпретации результата и проверки чувствительности. Пропущенное наблюдение не отождествляется с нулевой поставкой.</w:t>
-      </w:r>
-    </w:p>
-    <w:p>
-      <w:r>
-        <w:t>Из темпов отдельных ячеек строится индекс с фиксированными весами. Одна наблюдаемая структура применяется ко всей истории, после чего расчет повторяется с другой структурой при той же ковариационной матрице. Слово «условная» означает здесь фиксацию весов и выбранной истории колебаний. Такой показатель отличается от фактического темпа совокупного экспорта, для агрегирования которого требуются меняющиеся во времени веса. Он не является прогнозом условной дисперсии на следующий месяц. Ковариационная матрица оценивается отдельно для каждой страны; сравнение изменений внутри стран поэтому не предполагает тождества их ценовых циклов и производственных условий.</w:t>
-      </w:r>
-    </w:p>
-    <w:p>
-      <w:r>
-        <w:t>Одновременная замена товарных долей и географии может давать разные промежуточные результаты в зависимости от очередности. Принцип Шепли позволяет усреднить предельный вклад каждого фактора по двум порядкам замены. Как показано у Shorrocks, такой подход обеспечивает точное аддитивное разложение. В данной работе товарный и географический вклады складываются в изменение дисперсии, распределяя между собой взаимодействие факторов. Полученное разложение относится к выбранному представлению структуры и фиксированной ковариационной матрице.</w:t>
+        <w:t>Одновременное изменение нескольких характеристик структуры ставит вопрос о разделении их вкладов. Последовательная замена товарных долей и географии может давать разные промежуточные результаты в зависимости от очередности. Принцип Шепли позволяет усреднить предельный вклад каждого фактора по возможным порядкам замены. Как показано у Shorrocks, такой подход обеспечивает точное аддитивное разложение. Для двух факторов взаимодействие распределяется между ними, а вклады в сумме дают общее изменение выбранного показателя. Это свойство делает подход полезным для атрибуции структурных сдвигов при явно определенных условиях сравнения.</w:t>
       </w:r>
       <w:r>
         <w:rPr>
           <w:rStyle w:val="FootnoteReference"/>
         </w:rPr>
-        <w:footnoteReference w:id="30"/>
+        <w:footnoteReference w:id="38"/>
       </w:r>
       <w:r/>
     </w:p>
     <w:p>
       <w:r>
-        <w:t>Для представления масштаба колебаний используется стандартное отклонение, выраженное в процентных пунктах; аддитивные вклады в дисперсию имеют размерность квадрата процентных пунктов. Их нельзя напрямую складывать как вклады в стандартное отклонение. Интервалы оцениваются с сохранением временной зависимости наблюдений при фиксированных весах. Проверки на разных исторических окнах нужны потому, что общий отраслевой цикл и синхронность потоков могут меняться. Сопоставимость результата также требует проверки товарного охвата, объединения направлений и определения темпа.</w:t>
+        <w:t>Цель исследования состоит в оценке и объяснении связи товарных и географических изменений с условной исторической волатильностью экспорта интегральных схем Японии и Республики Корея. Объектом выступают экспортные поставки этих стран, предметом — роль их структуры в формировании колебаний номинальной стоимости. Сравнение относится к структурам 2017 и 2024 годов. Исследовательский вклад заключается в сопоставимом расчете для двух экспортеров, разделении товарного и географического вкладов и объяснении роли совместной динамики потоков. Такой подход развивает рассмотренные отраслевые постановки, сохраняя различие между статистической атрибуцией и причинным воздействием политики.</w:t>
       </w:r>
     </w:p>
     <w:p>
       <w:r>
-        <w:t>Экономическая интерпретация ограничена наблюдаемой стоимостной структурой. Сдвиг веса памяти может отражать цены и изменение состава изделий внутри кода; перемещение направления поставки может сохранять прежний конечный спрос. Реальная переориентация производства способна, кроме того, изменить сами темпы и ковариации. Поэтому историческое перевзвешивание дает оценку экспозиции к наблюдавшимся колебаниям, а причинный эффект торговых ограничений или осуществимой промышленной политики потребовал бы другой модели.</w:t>
+        <w:t>Теоретические основания анализа предполагают разграничение наблюдаемой волатильности и условного показателя при фиксированной структуре. В первом случае экспорт складывается из фактических потоков с меняющимися долями. Во втором случае одна структура применяется к общей истории изменений, что позволяет сопоставить ее свойства с другой структурой. Такое сравнение показывает, как распределение весов связано с совокупным разбросом при выбранной истории. Подробное определение темпов, построение весов и способ учета неопределенности относятся к аналитической части исследования.</w:t>
       </w:r>
     </w:p>
     <w:p>
       <w:r>
-        <w:t>Цель исследования состоит в оценке и объяснении изменения условной исторической волатильности при переходе от экспортной структуры 2017 года к структуре 2024 года. Эмпирический анализ устанавливает, совпадают ли направления изменения концентрации и волатильности, как соотносятся товарный и географический вклады и насколько их интерпретация зависит от исторического окна. Исследовательский вклад заключается в сопоставимом расчете для двух экспортеров, точной атрибуции структурных изменений и объяснении роли ковариаций внутри отрасли. Во второй главе рассматриваются данные и фактическая структура поставок, в третьей — модель, оценки вкладов и проверки их устойчивости.</w:t>
+        <w:t>Для содержательного вывода важны не только знак и величина структурного вклада, но и его устойчивость. Если результат существенно зависит от исторического окна или объединения направлений, это указывает на зависимость оценки от конкретных условий сравнения. Если он сохраняется при обоснованных альтернативных способах расчета, появляется более прочное основание для описания выявленного механизма. При этом стабильность номинальных экспортных поступлений остается одной из целей: ее следует соотносить с ростом, издержками изменения специализации и технологическими возможностями производителей.</w:t>
+      </w:r>
+    </w:p>
+    <w:p>
+      <w:r>
+        <w:t>Проведенный обзор задает последовательность дальнейшего исследования. Во второй главе анализируются данные, изменения экспортной структуры и результаты модели, включая проверку их устойчивости. В третьей главе на этой основе формулируются рекомендации по товарной и географической диверсификации, рассматриваются условия их реализации и показатели мониторинга. Связь между аналитическими результатами и рекомендациями определяется тем, какой механизм подтверждается расчетами и какие возможности его практического использования допускают особенности отрасли.</w:t>
       </w:r>
     </w:p>
     <w:p>
@@ -1522,7 +1703,7 @@
         <w:footnoteRef/>
       </w:r>
       <w:r>
-        <w:t xml:space="preserve"> Haramboure A.; Lalanne G.; Schwellnus C.; Guilhoto J. (2023). Vulnerabilities in the semiconductor supply chain. OECD Science, Technology and Industry Working Papers 2023/05. С. 3–5.</w:t>
+        <w:t xml:space="preserve"> Jo K.; Jung K.-C. (2023). Semiconductor Market Trends and Macroeconomic Implications. KDI Economic Outlook, First Half, 10 May. С. 6–7.</w:t>
       </w:r>
     </w:p>
   </w:footnote>
@@ -1538,7 +1719,7 @@
         <w:footnoteRef/>
       </w:r>
       <w:r>
-        <w:t xml:space="preserve"> World Customs Organization (2017). Harmonized System Nomenclature, Chapter 85, heading 85.42. Позиция 85.42.</w:t>
+        <w:t xml:space="preserve"> OECD (2025). Mapping the semiconductor value chain: Working towards identifying dependencies and vulnerabilities. OECD Science, Technology and Industry Policy Papers 182. С. 10–12.</w:t>
       </w:r>
     </w:p>
   </w:footnote>
@@ -1554,7 +1735,7 @@
         <w:footnoteRef/>
       </w:r>
       <w:r>
-        <w:t xml:space="preserve"> World Customs Organization (2022). Harmonized System Nomenclature, Chapter 85, heading 85.42. Позиция 85.42.</w:t>
+        <w:t xml:space="preserve"> Haramboure A.; Lalanne G.; Schwellnus C.; Guilhoto J. (2023). Vulnerabilities in the semiconductor supply chain. OECD Science, Technology and Industry Working Papers 2023/05. С. 3–5.</w:t>
       </w:r>
     </w:p>
   </w:footnote>
@@ -1570,7 +1751,7 @@
         <w:footnoteRef/>
       </w:r>
       <w:r>
-        <w:t xml:space="preserve"> Jo K.; Jung K.-C. (2023). Semiconductor Market Trends and Macroeconomic Implications. KDI Economic Outlook, First Half, 10 May. С. 1–3, 9.</w:t>
+        <w:t xml:space="preserve"> Haramboure A.; Lalanne G.; Schwellnus C.; Guilhoto J. (2023). Vulnerabilities in the semiconductor supply chain. OECD Science, Technology and Industry Working Papers 2023/05. С. 5, 10–12.</w:t>
       </w:r>
     </w:p>
   </w:footnote>
@@ -1586,7 +1767,7 @@
         <w:footnoteRef/>
       </w:r>
       <w:r>
-        <w:t xml:space="preserve"> Hillrichs D.; Wölfl A. (2026). More Chips, Anyone? Demand for Semiconductors in an Era of Active Industrial Policy. EconPol Forum 27(1), 35–42. С. 35–42.</w:t>
+        <w:t xml:space="preserve"> World Customs Organization (2017). Harmonized System Nomenclature, Chapter 85, heading 85.42. Позиция 85.42.</w:t>
       </w:r>
     </w:p>
   </w:footnote>
@@ -1602,7 +1783,7 @@
         <w:footnoteRef/>
       </w:r>
       <w:r>
-        <w:t xml:space="preserve"> Jo K.; Jung K.-C. (2023). Semiconductor Market Trends and Macroeconomic Implications. KDI Economic Outlook, First Half, 10 May. С. 1, 7–8.</w:t>
+        <w:t xml:space="preserve"> World Customs Organization (2022). Harmonized System Nomenclature, Chapter 85, heading 85.42. Позиция 85.42.</w:t>
       </w:r>
     </w:p>
   </w:footnote>
@@ -1618,7 +1799,7 @@
         <w:footnoteRef/>
       </w:r>
       <w:r>
-        <w:t xml:space="preserve"> Bank of Korea (2023). Characteristics of Demand Structure for Korea’s Semiconductors and Implications. Korea Economic Outlook, May, 53–62; English release 31 July. С. 53–62.</w:t>
+        <w:t xml:space="preserve"> Jo K.; Jung K.-C. (2023). Semiconductor Market Trends and Macroeconomic Implications. KDI Economic Outlook, First Half, 10 May. С. 1–3, 9.</w:t>
       </w:r>
     </w:p>
   </w:footnote>
@@ -1634,7 +1815,7 @@
         <w:footnoteRef/>
       </w:r>
       <w:r>
-        <w:t xml:space="preserve"> Bank of Korea (2023). Characteristics of Demand Structure for Korea’s Semiconductors and Implications. Korea Economic Outlook, May, 53–62; English release 31 July. С. 54, 61–62.</w:t>
+        <w:t xml:space="preserve"> Jo K.; Jung K.-C. (2023). Semiconductor Market Trends and Macroeconomic Implications. KDI Economic Outlook, First Half, 10 May. С. 4.</w:t>
       </w:r>
     </w:p>
   </w:footnote>
@@ -1650,7 +1831,7 @@
         <w:footnoteRef/>
       </w:r>
       <w:r>
-        <w:t xml:space="preserve"> Koh W. C. (2026). Tariffs, Tech Controls, and Techno-nationalism: Korea’s Semiconductor Industry in an Era of Sanctions and Strategic Competition. AMRO ACR-2026-03, Selected Issue 1. С. 1–6.</w:t>
+        <w:t xml:space="preserve"> Hillrichs D.; Wölfl A. (2026). More Chips, Anyone? Demand for Semiconductors in an Era of Active Industrial Policy. EconPol Forum 27(1), 35–42. С. 35–42.</w:t>
       </w:r>
     </w:p>
   </w:footnote>
@@ -1666,7 +1847,7 @@
         <w:footnoteRef/>
       </w:r>
       <w:r>
-        <w:t xml:space="preserve"> Li L.; Wang H.; Li Z.; Hu S. (2025). Analysis of the structure and robustness of the global semiconductor trade network. PLOS ONE 20(1), e0313162. Разделы о методах и устойчивости сети.</w:t>
+        <w:t xml:space="preserve"> Jo K.; Jung K.-C. (2023). Semiconductor Market Trends and Macroeconomic Implications. KDI Economic Outlook, First Half, 10 May. С. 1, 7–8.</w:t>
       </w:r>
     </w:p>
   </w:footnote>
@@ -1682,7 +1863,7 @@
         <w:footnoteRef/>
       </w:r>
       <w:r>
-        <w:t xml:space="preserve"> Cadot O.; Carrère C.; Strauss-Kahn V. (2011). Trade Diversification, Income, and Growth: What Do We Know? FERDI Working Paper P33, November. Раздел 2, с. 2–5.</w:t>
+        <w:t xml:space="preserve"> Jo K.; Jung K.-C. (2023). Semiconductor Market Trends and Macroeconomic Implications. KDI Economic Outlook, First Half, 10 May. С. 6–7.</w:t>
       </w:r>
     </w:p>
   </w:footnote>
@@ -1698,7 +1879,7 @@
         <w:footnoteRef/>
       </w:r>
       <w:r>
-        <w:t xml:space="preserve"> Markowitz H. (1952). Portfolio Selection. Journal of Finance 7(1), 77–91. С. 79–81.</w:t>
+        <w:t xml:space="preserve"> Bank of Korea (2023). Characteristics of Demand Structure for Korea’s Semiconductors and Implications. Korea Economic Outlook, May, 53–62; English release 31 July. С. 53–62.</w:t>
       </w:r>
     </w:p>
   </w:footnote>
@@ -1714,7 +1895,7 @@
         <w:footnoteRef/>
       </w:r>
       <w:r>
-        <w:t xml:space="preserve"> Koren M.; Tenreyro S. (2007). Volatility and Development. Quarterly Journal of Economics 122(1), 243–287. С. 243–244.</w:t>
+        <w:t xml:space="preserve"> Bank of Korea (2023). Characteristics of Demand Structure for Korea’s Semiconductors and Implications. Korea Economic Outlook, May, 53–62; English release 31 July. С. 53–62.</w:t>
       </w:r>
     </w:p>
   </w:footnote>
@@ -1730,7 +1911,7 @@
         <w:footnoteRef/>
       </w:r>
       <w:r>
-        <w:t xml:space="preserve"> Caselli F.; Koren M.; Lisicky M.; Tenreyro S. (2019). Diversification through Trade. Author manuscript, June. Авторская версия, июнь 2019 года, с. 2–3.</w:t>
+        <w:t xml:space="preserve"> Bank of Korea (2023). Characteristics of Demand Structure for Korea’s Semiconductors and Implications. Korea Economic Outlook, May, 53–62; English release 31 July. С. 54, 61–62.</w:t>
       </w:r>
     </w:p>
   </w:footnote>
@@ -1746,7 +1927,7 @@
         <w:footnoteRef/>
       </w:r>
       <w:r>
-        <w:t xml:space="preserve"> Vannoorenberghe G.; Wang Z.; Yu Z. (2014). Volatility and Diversification of Exports: Firm-Level Theory and Evidence. CESifo Working Paper 4916, July. Аннотация и введение рабочей версии, с. 1–3.</w:t>
+        <w:t xml:space="preserve"> Koh W. C. (2026). Tariffs, Tech Controls, and Techno-nationalism: Korea’s Semiconductor Industry in an Era of Sanctions and Strategic Competition. AMRO ACR-2026-03, Selected Issue 1. С. 1–6.</w:t>
       </w:r>
     </w:p>
   </w:footnote>
@@ -1762,7 +1943,7 @@
         <w:footnoteRef/>
       </w:r>
       <w:r>
-        <w:t xml:space="preserve"> Lee J.; Yu B.-K. (2019). The Effects of Export Diversification on Macroeconomic Stabilization: Evidence from Korea. KDI Journal of Economic Policy 41(1), 1–14. С. 5–11.</w:t>
+        <w:t xml:space="preserve"> Koh W. C. (2026). Tariffs, Tech Controls, and Techno-nationalism: Korea’s Semiconductor Industry in an Era of Sanctions and Strategic Competition. AMRO ACR-2026-03, Selected Issue 1. С. 1–6.</w:t>
       </w:r>
     </w:p>
   </w:footnote>
@@ -1778,7 +1959,7 @@
         <w:footnoteRef/>
       </w:r>
       <w:r>
-        <w:t xml:space="preserve"> Hong Q.; Jin Z.; Liu R.; Tong J. (2026). Demand Shocks, Export Diversification, and Firm Performance During the Great Trade Collapse. Journal of Economics &amp; Management Strategy, e70027, 1–18. Разделы 2–4 и 7 опубликованной электронной версии.</w:t>
+        <w:t xml:space="preserve"> Li L.; Wang H.; Li Z.; Hu S. (2025). Analysis of the structure and robustness of the global semiconductor trade network. PLOS ONE 20(1), e0313162. Разделы о методах и устойчивости сети.</w:t>
       </w:r>
     </w:p>
   </w:footnote>
@@ -1794,7 +1975,7 @@
         <w:footnoteRef/>
       </w:r>
       <w:r>
-        <w:t xml:space="preserve"> Esposito F. (2020). Demand Risk and Diversification through Trade. MPRA Paper 100398, May. С. 1–3 рабочей версии.</w:t>
+        <w:t xml:space="preserve"> Cadot O.; Carrère C.; Strauss-Kahn V. (2011). Trade Diversification, Income, and Growth: What Do We Know? FERDI Working Paper P33, November. Раздел 2, с. 2–5.</w:t>
       </w:r>
     </w:p>
   </w:footnote>
@@ -1810,7 +1991,7 @@
         <w:footnoteRef/>
       </w:r>
       <w:r>
-        <w:t xml:space="preserve"> Barigozzi M.; Cuzzola A.; Grazzi M.; Moschella D. (2025; online 2024). Factoring in the Micro: A Transaction-Level Dynamic Factor Approach to the Decomposition of Export Volatility. Oxford Bulletin of Economics and Statistics 87(1), 155–184. Разделы 2–5 опубликованной электронной версии.</w:t>
+        <w:t xml:space="preserve"> Markowitz H. (1952). Portfolio Selection. Journal of Finance 7(1), 77–91. С. 79–81.</w:t>
       </w:r>
     </w:p>
   </w:footnote>
@@ -1826,7 +2007,7 @@
         <w:footnoteRef/>
       </w:r>
       <w:r>
-        <w:t xml:space="preserve"> Shin S.-Y.; Shin S.-H. (2021). Analysis of Korean Import and Export in the Semiconductor Industry: A Global Supply Chain Perspective. Journal of Korea Trade 25(6), 78–104. С. 78–79, 97–98.</w:t>
+        <w:t xml:space="preserve"> Koren M.; Tenreyro S. (2007). Volatility and Development. Quarterly Journal of Economics 122(1), 243–287. С. 243–244.</w:t>
       </w:r>
     </w:p>
   </w:footnote>
@@ -1842,7 +2023,7 @@
         <w:footnoteRef/>
       </w:r>
       <w:r>
-        <w:t xml:space="preserve"> Koo J. H. (2026). Structural Changes in Korea’s Semiconductor Supply Chain under the Changing Economic Security Environment: An Analysis of Trade Structures, 2015–2025. Public Policy Review 40(2), 319–339. С. 324–325, 335–336.</w:t>
+        <w:t xml:space="preserve"> Caselli F.; Koren M.; Lisicky M.; Tenreyro S. (2019). Diversification through Trade. Author manuscript, June. Авторская версия, июнь 2019 года, с. 2–3.</w:t>
       </w:r>
     </w:p>
   </w:footnote>
@@ -1858,7 +2039,7 @@
         <w:footnoteRef/>
       </w:r>
       <w:r>
-        <w:t xml:space="preserve"> Kitetu G. M.; Mbante II A. R.; Ko J.-H. (2021). Revealed Trade Competitiveness between Korea and Japan. Is It Viable to Deepen Economic Integration? Journal of Global Business and Trade 17(2), 67–84. Аннотация опубликованной статьи, с. 67; полный файл не получен.</w:t>
+        <w:t xml:space="preserve"> Vannoorenberghe G.; Wang Z.; Yu Z. (2014). Volatility and Diversification of Exports: Firm-Level Theory and Evidence. CESifo Working Paper 4916, July. Аннотация и введение рабочей версии, с. 1–3.</w:t>
       </w:r>
     </w:p>
   </w:footnote>
@@ -1874,7 +2055,7 @@
         <w:footnoteRef/>
       </w:r>
       <w:r>
-        <w:t xml:space="preserve"> Yu A.; Yu S. (2026). U.S. Integrated Circuit Exports and Global Value Chain Positioning: Strategic Implications for International Business and Supply Chain Management. Open Journal of Business and Management 14(1), 51–67. Раздел 3, с. 54–57.</w:t>
+        <w:t xml:space="preserve"> Esposito F. (2020). Demand Risk and Diversification through Trade. MPRA Paper 100398, May. С. 1–3 рабочей версии.</w:t>
       </w:r>
     </w:p>
   </w:footnote>
@@ -1890,7 +2071,7 @@
         <w:footnoteRef/>
       </w:r>
       <w:r>
-        <w:t xml:space="preserve"> Hong M.-S. (2023). Analysis of export changes to major trading partners of the Korean semiconductor industry. The e-Business Studies 24(6), 179–189. Аннотация в KCI; полный текст не получен.</w:t>
+        <w:t xml:space="preserve"> Lee J.; Yu B.-K. (2019). The Effects of Export Diversification on Macroeconomic Stabilization: Evidence from Korea. KDI Journal of Economic Policy 41(1), 1–14. С. 5–11.</w:t>
       </w:r>
     </w:p>
   </w:footnote>
@@ -1906,7 +2087,7 @@
         <w:footnoteRef/>
       </w:r>
       <w:r>
-        <w:t xml:space="preserve"> Kim T.-H.; Lee M.-J. (2025). Assessing Trade Concentration, Dependency, and Resilience in Korea’s Semiconductor Supply Chain: A Network and Entropy-Based Approach. Journal of Korea Trade 29(7), 67–95. Аннотация в KCI; полный текст не получен.</w:t>
+        <w:t xml:space="preserve"> Hong Q.; Jin Z.; Liu R.; Tong J. (2026). Demand Shocks, Export Diversification, and Firm Performance During the Great Trade Collapse. Journal of Economics &amp; Management Strategy, e70027, 1–18. Разделы 2–4 и 7 опубликованной электронной версии.</w:t>
       </w:r>
     </w:p>
   </w:footnote>
@@ -1922,7 +2103,7 @@
         <w:footnoteRef/>
       </w:r>
       <w:r>
-        <w:t xml:space="preserve"> Kim C.-Y.; Park K. S. (2018). A Study on Analysis of Export Concentration of Korea: Application of Herfindahl-Hirschman Index, Concentration Ratio, Sharpe Ratio and Value-at-Risk. Korea International Commercial Review 33(3), 273–289. Аннотация в KCI; полный текст не получен.</w:t>
+        <w:t xml:space="preserve"> Esposito F. (2020). Demand Risk and Diversification through Trade. MPRA Paper 100398, May. С. 1–3 рабочей версии.</w:t>
       </w:r>
     </w:p>
   </w:footnote>
@@ -1938,7 +2119,7 @@
         <w:footnoteRef/>
       </w:r>
       <w:r>
-        <w:t xml:space="preserve"> Jo K.; Jung K.-C. (2023). Semiconductor Market Trends and Macroeconomic Implications. KDI Economic Outlook, First Half, 10 May. С. 3.</w:t>
+        <w:t xml:space="preserve"> Barigozzi M.; Cuzzola A.; Grazzi M.; Moschella D. (2025; online 2024). Factoring in the Micro: A Transaction-Level Dynamic Factor Approach to the Decomposition of Export Volatility. Oxford Bulletin of Economics and Statistics 87(1), 155–184. Разделы 2–5 опубликованной электронной версии.</w:t>
       </w:r>
     </w:p>
   </w:footnote>
@@ -1954,11 +2135,139 @@
         <w:footnoteRef/>
       </w:r>
       <w:r>
+        <w:t xml:space="preserve"> Shin S.-Y.; Shin S.-H. (2021). Analysis of Korean Import and Export in the Semiconductor Industry: A Global Supply Chain Perspective. Journal of Korea Trade 25(6), 78–104. С. 78–79, 97–98.</w:t>
+      </w:r>
+    </w:p>
+  </w:footnote>
+  <w:footnote w:id="30">
+    <w:p>
+      <w:pPr>
+        <w:pStyle w:val="FootnoteText"/>
+      </w:pPr>
+      <w:r>
+        <w:rPr>
+          <w:rStyle w:val="FootnoteReference"/>
+        </w:rPr>
+        <w:footnoteRef/>
+      </w:r>
+      <w:r>
+        <w:t xml:space="preserve"> Koo J. H. (2026). Structural Changes in Korea’s Semiconductor Supply Chain under the Changing Economic Security Environment: An Analysis of Trade Structures, 2015–2025. Public Policy Review 40(2), 319–339. С. 324–325, 335–336.</w:t>
+      </w:r>
+    </w:p>
+  </w:footnote>
+  <w:footnote w:id="31">
+    <w:p>
+      <w:pPr>
+        <w:pStyle w:val="FootnoteText"/>
+      </w:pPr>
+      <w:r>
+        <w:rPr>
+          <w:rStyle w:val="FootnoteReference"/>
+        </w:rPr>
+        <w:footnoteRef/>
+      </w:r>
+      <w:r>
+        <w:t xml:space="preserve"> Kitetu G. M.; Mbante II A. R.; Ko J.-H. (2021). Revealed Trade Competitiveness between Korea and Japan. Is It Viable to Deepen Economic Integration? Journal of Global Business and Trade 17(2), 67–84. Аннотация опубликованной статьи, с. 67; полный файл не получен.</w:t>
+      </w:r>
+    </w:p>
+  </w:footnote>
+  <w:footnote w:id="32">
+    <w:p>
+      <w:pPr>
+        <w:pStyle w:val="FootnoteText"/>
+      </w:pPr>
+      <w:r>
+        <w:rPr>
+          <w:rStyle w:val="FootnoteReference"/>
+        </w:rPr>
+        <w:footnoteRef/>
+      </w:r>
+      <w:r>
+        <w:t xml:space="preserve"> Yu A.; Yu S. (2026). U.S. Integrated Circuit Exports and Global Value Chain Positioning: Strategic Implications for International Business and Supply Chain Management. Open Journal of Business and Management 14(1), 51–67. Раздел 3, с. 54–57.</w:t>
+      </w:r>
+    </w:p>
+  </w:footnote>
+  <w:footnote w:id="33">
+    <w:p>
+      <w:pPr>
+        <w:pStyle w:val="FootnoteText"/>
+      </w:pPr>
+      <w:r>
+        <w:rPr>
+          <w:rStyle w:val="FootnoteReference"/>
+        </w:rPr>
+        <w:footnoteRef/>
+      </w:r>
+      <w:r>
+        <w:t xml:space="preserve"> Hong M.-S. (2023). Analysis of export changes to major trading partners of the Korean semiconductor industry. The e-Business Studies 24(6), 179–189. Аннотация в KCI; полный текст не получен.</w:t>
+      </w:r>
+    </w:p>
+  </w:footnote>
+  <w:footnote w:id="34">
+    <w:p>
+      <w:pPr>
+        <w:pStyle w:val="FootnoteText"/>
+      </w:pPr>
+      <w:r>
+        <w:rPr>
+          <w:rStyle w:val="FootnoteReference"/>
+        </w:rPr>
+        <w:footnoteRef/>
+      </w:r>
+      <w:r>
+        <w:t xml:space="preserve"> Kim T.-H.; Lee M.-J. (2025). Assessing Trade Concentration, Dependency, and Resilience in Korea’s Semiconductor Supply Chain: A Network and Entropy-Based Approach. Journal of Korea Trade 29(7), 67–95. Аннотация в KCI; полный текст не получен.</w:t>
+      </w:r>
+    </w:p>
+  </w:footnote>
+  <w:footnote w:id="35">
+    <w:p>
+      <w:pPr>
+        <w:pStyle w:val="FootnoteText"/>
+      </w:pPr>
+      <w:r>
+        <w:rPr>
+          <w:rStyle w:val="FootnoteReference"/>
+        </w:rPr>
+        <w:footnoteRef/>
+      </w:r>
+      <w:r>
+        <w:t xml:space="preserve"> Kim C.-Y.; Park K. S. (2018). A Study on Analysis of Export Concentration of Korea: Application of Herfindahl-Hirschman Index, Concentration Ratio, Sharpe Ratio and Value-at-Risk. Korea International Commercial Review 33(3), 273–289. Аннотация в KCI; полный текст не получен.</w:t>
+      </w:r>
+    </w:p>
+  </w:footnote>
+  <w:footnote w:id="36">
+    <w:p>
+      <w:pPr>
+        <w:pStyle w:val="FootnoteText"/>
+      </w:pPr>
+      <w:r>
+        <w:rPr>
+          <w:rStyle w:val="FootnoteReference"/>
+        </w:rPr>
+        <w:footnoteRef/>
+      </w:r>
+      <w:r>
+        <w:t xml:space="preserve"> Jo K.; Jung K.-C. (2023). Semiconductor Market Trends and Macroeconomic Implications. KDI Economic Outlook, First Half, 10 May. С. 3.</w:t>
+      </w:r>
+    </w:p>
+  </w:footnote>
+  <w:footnote w:id="37">
+    <w:p>
+      <w:pPr>
+        <w:pStyle w:val="FootnoteText"/>
+      </w:pPr>
+      <w:r>
+        <w:rPr>
+          <w:rStyle w:val="FootnoteReference"/>
+        </w:rPr>
+        <w:footnoteRef/>
+      </w:r>
+      <w:r>
         <w:t xml:space="preserve"> Bank of Korea (2023). Characteristics of Demand Structure for Korea’s Semiconductors and Implications. Korea Economic Outlook, May, 53–62; English release 31 July. С. 61–62.</w:t>
       </w:r>
     </w:p>
   </w:footnote>
-  <w:footnote w:id="30">
+  <w:footnote w:id="38">
     <w:p>
       <w:pPr>
         <w:pStyle w:val="FootnoteText"/>

</xml_diff>

<commit_message>
Refine thesis contribution, practical cases and final editorial quality
</commit_message>
<xml_diff>
--- a/research/02_chip_trade/documents/chapter1.docx
+++ b/research/02_chip_trade/documents/chapter1.docx
@@ -66,7 +66,7 @@
     </w:p>
     <w:p>
       <w:r>
-        <w:t>Для странового анализа также важно различать территорию производства и принадлежность компании. Предприятие, расположенное за рубежом, участвует в торговой статистике территории, из которой отправляется продукция, тогда как результаты международной компании могут объединять операции в нескольких странах. Поэтому отраслевые данные о компаниях и таможенные показатели характеризуют разные совокупности. В настоящей работе национальная принадлежность экспортного потока определяется страной регистрации вывоза. Такое определение позволяет последовательно изучать международные поставки, однако само по себе не устанавливает распределение прибыли и технологических компетенций между владельцами предприятий.</w:t>
+        <w:t>Территория вывоза и принадлежность компании задают разные границы анализа. Продажи зарубежной фабрики входят в торговую статистику страны отгрузки, тогда как консолидированная отчетность группы объединяет операции в нескольких странах. Здесь исследуется зарегистрированный экспорт с территории Японии и Кореи; распределение прибыли и технологических компетенций между владельцами предприятий отдельно не оценивается.</w:t>
       </w:r>
     </w:p>
     <w:p>
@@ -128,7 +128,7 @@
     </w:p>
     <w:p>
       <w:r>
-        <w:t>Сопоставимость классификации необходима и для правильного определения самой диверсификации. Изменение ассортимента внутри одного шестизначного кода может быть технологически существенным, но не отразиться в числе наблюдаемых категорий. Напротив, рост стоимости небольшой категории изменит измеряемые доли даже без появления нового изделия. Поэтому товарная диверсификация на уровне HS характеризует распределение экспортной стоимости между статистическими группами. Ее связь с инновациями, сложностью производства и качеством продукции должна устанавливаться отдельно. Для поставленного вопроса важна прежде всего возможность последовательно сравнивать одни и те же группы во времени.</w:t>
+        <w:t>Товарная диверсификация на уровне HS характеризует распределение стоимости между статистическими группами. Освоение нового изделия внутри одного кода может не изменить число категорий, а рост небольшой категории — изменить их доли без появления новой технологии. Поэтому выводы об инновациях и качестве продукции требуют более подробных данных.</w:t>
       </w:r>
     </w:p>
     <w:p>
@@ -169,7 +169,7 @@
     </w:p>
     <w:p>
       <w:r>
-        <w:t>Неодинаковое применение компонентов создает возможность несовпадения циклов спроса. Изменение потребности в одном виде конечного оборудования не обязано в той же степени затрагивать другие области использования чипов. Вместе с тем разные изделия могут зависеть от общих инвестиционных решений покупателей или от одного этапа обновления техники. В результате увеличение числа товарных категорий не гарантирует пропорционального увеличения числа независимых источников выручки. Для анализа полезно сохранять различие между наблюдаемым разнообразием продукции и экономическими причинами, которые одновременно меняют спрос на несколько ее видов.</w:t>
+        <w:t>Различия применения компонентов создают возможность несовпадения циклов спроса. Однако несколько изделий могут зависеть от общих инвестиционных решений покупателей или одного этапа обновления техники. Поэтому число товарных категорий не равно числу независимых источников выручки.</w:t>
       </w:r>
     </w:p>
     <w:p>
@@ -198,7 +198,7 @@
     </w:p>
     <w:p>
       <w:r>
-        <w:t>Стоимостная структура чувствительна к относительным ценам. Если стоимость одной категории падает при неизменной стоимости остальных, ее доля сокращается, а относительный вес остальных категорий увеличивается. Такое перераспределение не обязательно свидетельствует о целенаправленном выходе в новые сегменты. Аналогично увеличение доли отдельного направления может происходить потому, что другие рынки переживают более глубокий спад. Поэтому описание структурных сдвигов должно связывать относительные доли с абсолютной стоимостью потоков. Это особенно существенно при сравнении начала и конца периода, которые могут соответствовать различным фазам отраслевого цикла.</w:t>
+        <w:t>Изменение долей следует сопоставлять с абсолютной стоимостью поставок. Например, удешевление памяти повышает относительный вес остальных схем даже без роста их экспорта. Аналогично увеличение доли страны может отражать более глубокий спад на других направлениях. Это особенно существенно при сравнении лет, относящихся к разным фазам отраслевого цикла.</w:t>
       </w:r>
     </w:p>
     <w:p>
@@ -275,7 +275,7 @@
     </w:p>
     <w:p>
       <w:r>
-        <w:t>Таким образом, международная торговля интегральными схемами характеризуется неоднородностью продукции и многостадийным размещением производства. Эти особенности определяют два требования к дальнейшему анализу. Товарные категории необходимо рассматривать раздельно, а распределение экспорта между странами следует интерпретировать с учетом производственных связей. Совокупный показатель концентрации полезен для первоначального описания структуры, но для оценки ее связи с волатильностью требуется информация о динамике составляющих потоков.</w:t>
+        <w:t>Неоднородность продукции и международное разделение производства определяют требования к анализу: сохранять товарную детализацию и учитывать совместную динамику направлений. Эти требования связывают отраслевые особенности с выбором показателей диверсификации и волатильности.</w:t>
       </w:r>
     </w:p>
     <w:p>
@@ -305,7 +305,7 @@
     </w:p>
     <w:p>
       <w:r>
-        <w:t>Расширение набора товаров и изменение долей уже существующих категорий могут происходить одновременно. Однако их экономическое содержание различается. В первом случае требуется освоение нового направления деятельности или начало поставок на ранее не обслуживаемый рынок. Во втором случае меняется относительный масштаб знакомых операций. Для отрасли с высокими затратами освоения производства это различие существенно: одинаковое снижение концентрации может сопровождаться разной потребностью в инвестициях, знаниях и времени. Поэтому числовой показатель диверсификации необходимо дополнять описанием того, за счет каких потоков он изменился.</w:t>
+        <w:t>Освоение нового изделия или рынка требует иных затрат, чем расширение уже действующих поставок. Поэтому одинаковое снижение концентрации может сопровождаться разной потребностью в инвестициях и времени. Экономическая оценка структурного сдвига должна учитывать, какие именно операции обеспечили изменение долей.</w:t>
       </w:r>
     </w:p>
     <w:p>
@@ -1163,7 +1163,7 @@
     </w:p>
     <w:p>
       <w:r>
-        <w:t>Результат Lee и Yu относится к реакции экспортных отраслей на конкретный кризис. Показатель, связанный с меньшим падением в этом эпизоде, может быть полезен для объяснения уязвимости к сходному внешнему спаду, но его содержание отличается от среднего разброса темпов на протяжении нескольких фаз цикла. Для настоящего исследования это различие определяет способ постановки вопроса: необходимо оценивать всю выбранную историю колебаний, одновременно проверяя, насколько вывод зависит от отдельных ее участков. Такое расширение горизонта дополняет кризисный анализ, сохраняя различие между измеряемыми результатами.</w:t>
+        <w:t>Меньшее падение в отдельном кризисе и меньший разброс темпов за несколько фаз цикла являются разными результатами. Поэтому для настоящей работы требуется оценка всей истории колебаний с отдельной проверкой роли ее наиболее нестабильных участков.</w:t>
       </w:r>
     </w:p>
     <w:p>
@@ -1192,7 +1192,7 @@
     </w:p>
     <w:p>
       <w:r>
-        <w:t>Эндогенность экспортной структуры создает отдельную задачу интерпретации. Более устойчивые предприятия могут легче осваивать новые направления, а ожидание неблагоприятной конъюнктуры — побуждать к изменению товарных долей. Наблюдаемое сочетание структуры и динамики в таком случае отражает и влияние внешних условий, и реакцию участников. Историческое сравнение нескольких наборов весов позволяет отделить арифметическое значение структуры при заданных колебаниях. Для объяснения того, почему была выбрана именно эта структура и как участники изменили бы поведение при другой политике, необходима дополнительная модель их решений.</w:t>
+        <w:t>Экспортная структура эндогенна: устойчивые предприятия могут легче осваивать новые рынки, а ожидание спада — побуждать к смене товарных долей. Перевзвешивание отделяет арифметическое значение структуры при заданных колебаниях. Объяснение выбора этой структуры и реакции участников на другую политику требует модели их решений.</w:t>
       </w:r>
     </w:p>
     <w:p>
@@ -1209,12 +1209,7 @@
     </w:p>
     <w:p>
       <w:r>
-        <w:t>Факторное разложение и структурное перевзвешивание различаются прежде всего тем, что считается изменяемой величиной. В первом случае исследователь стремится выделить общие и специфические составляющие динамики наблюдаемых потоков. Во втором случае сама история этих потоков сохраняется, а сравниваются способы их агрегирования. Выделение общего фактора помогает объяснить происхождение согласованных колебаний; изменение весов показывает, какую роль эти колебания играют при другой структуре. Поэтому близость исходного понятия волатильности не означает совпадения исследовательских задач, а результаты двух подходов могут содержательно дополнять друг друга.</w:t>
-      </w:r>
-    </w:p>
-    <w:p>
-      <w:r>
-        <w:t>Сопоставление этих работ позволяет разграничить объяснение происхождения шоков и оценку экспозиции к уже наблюдавшимся колебаниям. Структурная модель спроса, инструментальные переменные и факторная модель требуют разных данных и идентифицирующих предпосылок. Ковариационная оценка зарегистрированного экспорта объединяет изменения спроса, предложения, цен и состава продукции. Ее достоинство для поставленной задачи заключается в возможности применить к одной истории несколько точно определенных структур. Это позволяет количественно отделить изменение весов от смены самого исторического окна.</w:t>
+        <w:t>Факторная модель разделяет источники динамики потоков, а структурное перевзвешивание сравнивает способы их агрегирования. Эти подходы дополняют друг друга: первый объясняет происхождение совместных колебаний, второй — их значение при разных экспортных долях.</w:t>
       </w:r>
     </w:p>
     <w:p>
@@ -1247,7 +1242,7 @@
     </w:p>
     <w:p>
       <w:r>
-        <w:t>Сопоставление отраслевых работ требует одинаково трактовать границы продукции. Память и другие готовые схемы, производственное оборудование, материалы и части занимают разные места в цепочке. Совместный показатель по широкому набору может отражать одновременно изменения спроса на чипы и инвестиции в создание новых мощностей. Более узкая совокупность позволяет конкретизировать вопрос, но не описывает все формы специализации страны. Поэтому различие результатов исследований следует сначала проверить на уровне состава товаров и только затем связывать с выбором метода или экономическими особенностями рассматриваемого периода.</w:t>
+        <w:t>Различия отраслевых результатов следует сначала проверить на уровне товарного охвата. Совместный показатель по чипам, материалам и оборудованию объединяет спрос на компоненты с инвестициями в новые мощности. Узкая совокупность интегральных схем позволяет точнее поставить вопрос, сохраняя за пределами анализа другие формы специализации страны.</w:t>
       </w:r>
     </w:p>
     <w:p>
@@ -1336,7 +1331,7 @@
     </w:p>
     <w:p>
       <w:r>
-        <w:t>Сценарий KDI важен и как пример границ интерпретации. Сохранение темпов сегментов позволяет выделить значение их долей для наблюдаемого сокращения экспорта. Однако оно не означает, что страна могла бы без издержек и без изменения рыночных условий перейти к среднемировому составу. Для расчета дисперсии аналогичное условие относится к совместной истории потоков: заменяются веса, а наблюдавшиеся колебания используются как общая основа сравнения. Поэтому содержательный вклад такого анализа состоит в оценке структурной подверженности уже наблюдавшимся изменениям, а не в прогнозе результата конкретной промышленной программы.</w:t>
+        <w:t>Применение единой истории темпов к разным структурам сохраняет условие сценария KDI: меняются веса, но не поведение участников и не рыночные условия. Полученная разность характеризует подверженность наблюдавшимся колебаниям; она не показывает стоимость или результат фактического перехода к другому составу экспорта.</w:t>
       </w:r>
     </w:p>
     <w:p>
@@ -1353,7 +1348,7 @@
     </w:p>
     <w:p>
       <w:r>
-        <w:t>В рассмотренной литературе сформированы необходимые теоретические и отраслевые основания исследования, но разные подходы объясняют разные величины. Показатели концентрации описывают распределение долей, сценарий KDI — вклад состава продукции в конкретное падение, факторное разложение — источники колебаний. Задача настоящей работы связывает эти направления на уровне товарно-географических потоков: определить, какую разницу в условной дисперсии дают наблюдаемые изменения товарных долей и географии внутри категорий, как собственные дисперсии и ковариации формируют эту разницу и сохраняется ли ее направление в разных исторических условиях. Это конкретный прикладной вопрос, выходящий за пределы обновления периода описательной статистики.</w:t>
+        <w:t>Рассмотренные исследования позволяют конкретизировать вклад настоящей работы. В отличие от оценки падения за один эпизод, сравнивается дисперсия месячных темпов на общем интервале. Товарные доли и география внутри категорий изменяются раздельно, что позволяет выявить их взаимную компенсацию, а разложение на собственные дисперсии и ковариации объясняет ее механизм. Сопоставление Японии и Кореи при одинаковых определениях дополнено оценкой неопределенности и чувствительности к историческому окну. Новым результатом выступает такое эмпирическое сопоставление; используемые принципы перевзвешивания и декомпозиции разработаны в предшествующей литературе.</w:t>
       </w:r>
     </w:p>
     <w:p>
@@ -1370,22 +1365,12 @@
     </w:p>
     <w:p>
       <w:r>
-        <w:t>Цель исследования состоит в оценке и объяснении связи товарных и географических изменений с условной исторической волатильностью экспорта интегральных схем Японии и Республики Корея. Объектом выступают экспортные поставки этих стран, предметом — роль их структуры в формировании колебаний номинальной стоимости. Сравнение относится к структурам 2017 и 2024 годов. Исследовательский вклад заключается в сопоставимом расчете для двух экспортеров, разделении товарного и географического вкладов и объяснении роли совместной динамики потоков. Такой подход развивает рассмотренные отраслевые постановки, сохраняя различие между статистической атрибуцией и причинным воздействием политики.</w:t>
+        <w:t>Подробное определение месячных темпов, построение весов 2017 и 2024 годов и учет неопределенности приведены в следующей главе. Эти процедуры необходимы для проверки, сохраняется ли найденное соотношение вкладов при изменении способов расчета.</w:t>
       </w:r>
     </w:p>
     <w:p>
       <w:r>
-        <w:t>Теоретические основания анализа предполагают разграничение наблюдаемой волатильности и условного показателя при фиксированной структуре. В первом случае экспорт складывается из фактических потоков с меняющимися долями. Во втором случае одна структура применяется к общей истории изменений, что позволяет сопоставить ее свойства с другой структурой. Такое сравнение показывает, как распределение весов связано с совокупным разбросом при выбранной истории. Подробное определение темпов, построение весов и способ учета неопределенности относятся к аналитической части исследования.</w:t>
-      </w:r>
-    </w:p>
-    <w:p>
-      <w:r>
-        <w:t>Для содержательного вывода важны не только знак и величина структурного вклада, но и его устойчивость. Если результат существенно зависит от исторического окна или объединения направлений, это указывает на зависимость оценки от конкретных условий сравнения. Если он сохраняется при обоснованных альтернативных способах расчета, появляется более прочное основание для описания выявленного механизма. При этом стабильность номинальных экспортных поступлений остается одной из целей: ее следует соотносить с ростом, издержками изменения специализации и технологическими возможностями производителей.</w:t>
-      </w:r>
-    </w:p>
-    <w:p>
-      <w:r>
-        <w:t>Проведенный обзор задает последовательность дальнейшего исследования. Во второй главе анализируются данные, изменения экспортной структуры и результаты модели, включая проверку их устойчивости. В третьей главе на этой основе формулируются рекомендации по товарной и географической диверсификации, рассматриваются условия их реализации и показатели мониторинга. Связь между аналитическими результатами и рекомендациями определяется тем, какой механизм подтверждается расчетами и какие возможности его практического использования допускают особенности отрасли.</w:t>
+        <w:t>Результаты структурного анализа используются для обоснования направлений дальнейшей диверсификации. Их практическая применимость зависит от спроса, затрат освоения продукции и технологических возможностей производителей; эти условия рассматриваются в третьей главе.</w:t>
       </w:r>
     </w:p>
     <w:p>
@@ -2167,7 +2152,7 @@
         <w:footnoteRef/>
       </w:r>
       <w:r>
-        <w:t xml:space="preserve"> Kitetu G. M.; Mbante II A. R.; Ko J.-H. (2021). Revealed Trade Competitiveness between Korea and Japan. Is It Viable to Deepen Economic Integration? Journal of Global Business and Trade 17(2), 67–84. Аннотация опубликованной статьи, с. 67; полный файл не получен.</w:t>
+        <w:t xml:space="preserve"> Kitetu G. M.; Mbante II A. R.; Ko J.-H. (2021). Revealed Trade Competitiveness between Korea and Japan. Is It Viable to Deepen Economic Integration? Journal of Global Business and Trade 17(2), 67–84. Раздел IV, с. 72–74; таблица 1, с. 75; авторская копия опубликованной статьи.</w:t>
       </w:r>
     </w:p>
   </w:footnote>

</xml_diff>